<commit_message>
Reconcile weekly resource mappings
</commit_message>
<xml_diff>
--- a/STARLAB_Unit_1/Teaching Guides/01_Week_1_Entering_STARLAB_Research_Culture_Curiosity_and_Ethics.docx
+++ b/STARLAB_Unit_1/Teaching Guides/01_Week_1_Entering_STARLAB_Research_Culture_Curiosity_and_Ethics.docx
@@ -208,6 +208,12 @@
           <w:rtl w:val="0"/>
         </w:rPr>
         <w:t xml:space="preserve">Teacher Materials</w:t>
+      </w:r>
+    </w:p>
+    <w:p>
+      <w:pPr/>
+      <w:r>
+        <w:t>Slide Decks: Deck 1 - Authentic Research and Course Launch; Deck 3 - Research Ethics, Safety, and Integrity</w:t>
       </w:r>
     </w:p>
     <w:p>

</xml_diff>

<commit_message>
Align weekly support resource mappings
</commit_message>
<xml_diff>
--- a/STARLAB_Unit_1/Teaching Guides/01_Week_1_Entering_STARLAB_Research_Culture_Curiosity_and_Ethics.docx
+++ b/STARLAB_Unit_1/Teaching Guides/01_Week_1_Entering_STARLAB_Research_Culture_Curiosity_and_Ethics.docx
@@ -342,6 +342,24 @@
           <w:rtl w:val="0"/>
         </w:rPr>
         <w:t xml:space="preserve">Appendix C: Research Fields and Topic Bank</w:t>
+      </w:r>
+    </w:p>
+    <w:p>
+      <w:pPr/>
+      <w:r>
+        <w:t>Optional / Teacher Reference - Appendix I: Optional Project Card Sorting Activity</w:t>
+      </w:r>
+    </w:p>
+    <w:p>
+      <w:pPr/>
+      <w:r>
+        <w:t>Optional / Teacher Reference - Appendix J: Optional Initial Parent or Guardian Communication</w:t>
+      </w:r>
+    </w:p>
+    <w:p>
+      <w:pPr/>
+      <w:r>
+        <w:t>Optional / Teacher Reference - Appendix L: Differentiation and Implementation Notes</w:t>
       </w:r>
     </w:p>
     <w:p>

</xml_diff>

<commit_message>
Standardize weekly guide branding
</commit_message>
<xml_diff>
--- a/STARLAB_Unit_1/Teaching Guides/01_Week_1_Entering_STARLAB_Research_Culture_Curiosity_and_Ethics.docx
+++ b/STARLAB_Unit_1/Teaching Guides/01_Week_1_Entering_STARLAB_Research_Culture_Curiosity_and_Ethics.docx
@@ -4,37 +4,63 @@
   <w:body>
     <w:p>
       <w:pPr>
-        <w:pStyle w:val="Heading1"/>
-        <w:keepNext w:val="0"/>
-        <w:keepLines w:val="0"/>
-        <w:spacing w:before="480" w:lineRule="auto"/>
-        <w:rPr>
-          <w:b w:val="1"/>
-          <w:bCs w:val="1"/>
-          <w:sz w:val="46"/>
-          <w:szCs w:val="46"/>
-        </w:rPr>
-      </w:pPr>
-      <w:bookmarkStart w:colFirst="0" w:colLast="0" w:name="_eiscfnd7iyj0" w:id="12"/>
-      <w:bookmarkEnd w:id="12"/>
+        <w:pStyle w:val="STARLABBrand"/>
+        <w:keepNext/>
+        <w:widowControl/>
+        <w:spacing w:before="0" w:after="40" w:line="240" w:lineRule="auto"/>
+      </w:pPr>
       <w:r>
         <w:rPr>
-          <w:b w:val="1"/>
-          <w:bCs w:val="1"/>
-          <w:sz w:val="46"/>
-          <w:szCs w:val="46"/>
-          <w:rtl w:val="0"/>
-        </w:rPr>
-        <w:t xml:space="preserve">Week 1: Entering STARLAB — Research Culture, Curiosity, and Ethics</w:t>
+          <w:rFonts w:ascii="Arial" w:hAnsi="Arial"/>
+          <w:b/>
+          <w:color w:val="E31B23"/>
+        </w:rPr>
+        <w:t>STARLAB</w:t>
       </w:r>
     </w:p>
     <w:p>
       <w:pPr>
+        <w:pStyle w:val="STARLABWeekTitle"/>
+        <w:keepNext/>
+        <w:widowControl/>
+        <w:spacing w:before="0" w:after="80" w:line="240" w:lineRule="auto"/>
+      </w:pPr>
+      <w:r>
+        <w:rPr>
+          <w:rFonts w:ascii="Arial" w:hAnsi="Arial"/>
+          <w:b/>
+          <w:color w:val="111111"/>
+        </w:rPr>
+        <w:t>Week 1: Entering STARLAB — Research Culture, Curiosity, and Ethics</w:t>
+      </w:r>
+    </w:p>
+    <w:p>
+      <w:pPr>
+        <w:pStyle w:val="STARLABGuideSubtitle"/>
+        <w:keepNext/>
+        <w:widowControl/>
+        <w:pBdr>
+          <w:bottom w:val="single" w:sz="14" w:space="5" w:color="E31B23"/>
+        </w:pBdr>
+        <w:spacing w:before="0" w:after="260" w:line="240" w:lineRule="auto"/>
+      </w:pPr>
+      <w:r>
+        <w:rPr>
+          <w:rFonts w:ascii="Arial" w:hAnsi="Arial"/>
+          <w:color w:val="555555"/>
+        </w:rPr>
+        <w:t>STARLAB Unit 1 Teaching Guide</w:t>
+      </w:r>
+    </w:p>
+    <w:p>
+      <w:pPr>
         <w:pStyle w:val="Heading2"/>
-        <w:keepNext w:val="0"/>
+        <w:keepNext/>
         <w:keepLines w:val="0"/>
-        <w:spacing w:after="80" w:lineRule="auto"/>
-        <w:rPr>
+        <w:widowControl/>
+        <w:spacing w:after="80" w:lineRule="auto" w:before="220" w:line="240"/>
+        <w:rPr>
+          <w:rFonts w:ascii="Arial" w:hAnsi="Arial" w:eastAsia="Arial" w:cs="Arial"/>
           <w:b w:val="1"/>
           <w:bCs w:val="1"/>
           <w:sz w:val="34"/>
@@ -45,1690 +71,2228 @@
       <w:bookmarkEnd w:id="13"/>
       <w:r>
         <w:rPr>
+          <w:rFonts w:ascii="Arial" w:hAnsi="Arial" w:eastAsia="Arial" w:cs="Arial"/>
+          <w:b/>
+          <w:bCs w:val="1"/>
+          <w:color w:val="E31B23"/>
+          <w:sz w:val="34"/>
+          <w:szCs w:val="34"/>
+          <w:rtl w:val="0"/>
+        </w:rPr>
+        <w:t xml:space="preserve">Teacher Overview</w:t>
+      </w:r>
+    </w:p>
+    <w:p>
+      <w:pPr>
+        <w:keepNext w:val="0"/>
+        <w:widowControl/>
+        <w:spacing w:after="80" w:before="0" w:lineRule="auto" w:line="252"/>
+        <w:rPr>
+          <w:rFonts w:ascii="Arial" w:hAnsi="Arial" w:eastAsia="Arial" w:cs="Arial"/>
+        </w:rPr>
+      </w:pPr>
+      <w:r>
+        <w:rPr>
+          <w:rFonts w:ascii="Arial" w:hAnsi="Arial" w:eastAsia="Arial" w:cs="Arial"/>
+          <w:color w:val="111111"/>
+          <w:rtl w:val="0"/>
+        </w:rPr>
+        <w:t xml:space="preserve">The first week should orient students to the purpose of STARLAB and help them begin seeing themselves as researchers. The emphasis should be on mindset, curiosity, responsibility, and possibility. Students should leave the week understanding that STARLAB is not a traditional class where every student completes the same assignment in the same way. It is a structured research environment where students develop, test, revise, document, and communicate original work.</w:t>
+      </w:r>
+    </w:p>
+    <w:p>
+      <w:pPr>
+        <w:pStyle w:val="Heading2"/>
+        <w:keepNext/>
+        <w:keepLines w:val="0"/>
+        <w:widowControl/>
+        <w:spacing w:after="80" w:lineRule="auto" w:before="220" w:line="240"/>
+        <w:rPr>
+          <w:rFonts w:ascii="Arial" w:hAnsi="Arial" w:eastAsia="Arial" w:cs="Arial"/>
           <w:b w:val="1"/>
           <w:bCs w:val="1"/>
           <w:sz w:val="34"/>
           <w:szCs w:val="34"/>
+        </w:rPr>
+      </w:pPr>
+      <w:bookmarkStart w:colFirst="0" w:colLast="0" w:name="_9lw8c3ujmhuf" w:id="14"/>
+      <w:bookmarkEnd w:id="14"/>
+      <w:r>
+        <w:rPr>
+          <w:rFonts w:ascii="Arial" w:hAnsi="Arial" w:eastAsia="Arial" w:cs="Arial"/>
+          <w:b/>
+          <w:bCs w:val="1"/>
+          <w:color w:val="E31B23"/>
+          <w:sz w:val="34"/>
+          <w:szCs w:val="34"/>
           <w:rtl w:val="0"/>
         </w:rPr>
-        <w:t xml:space="preserve">Teacher Overview</w:t>
+        <w:t xml:space="preserve">Weekly Objectives</w:t>
       </w:r>
     </w:p>
     <w:p>
       <w:pPr>
-        <w:spacing w:after="240" w:before="240" w:lineRule="auto"/>
-        <w:rPr/>
+        <w:pStyle w:val="STARLABLabel"/>
+        <w:keepNext/>
+        <w:widowControl/>
+        <w:spacing w:after="20" w:before="80" w:lineRule="auto" w:line="240"/>
+        <w:rPr>
+          <w:rFonts w:ascii="Arial" w:hAnsi="Arial" w:eastAsia="Arial" w:cs="Arial"/>
+        </w:rPr>
       </w:pPr>
       <w:r>
         <w:rPr>
+          <w:rFonts w:ascii="Arial" w:hAnsi="Arial" w:eastAsia="Arial" w:cs="Arial"/>
+          <w:b/>
+          <w:color w:val="111111"/>
           <w:rtl w:val="0"/>
         </w:rPr>
-        <w:t xml:space="preserve">The first week should orient students to the purpose of STARLAB and help them begin seeing themselves as researchers. The emphasis should be on mindset, curiosity, responsibility, and possibility. Students should leave the week understanding that STARLAB is not a traditional class where every student completes the same assignment in the same way. It is a structured research environment where students develop, test, revise, document, and communicate original work.</w:t>
+        <w:t xml:space="preserve">Students will be able to:</w:t>
       </w:r>
     </w:p>
     <w:p>
       <w:pPr>
+        <w:keepNext w:val="0"/>
+        <w:widowControl/>
+        <w:numPr>
+          <w:ilvl w:val="0"/>
+          <w:numId w:val="73"/>
+        </w:numPr>
+        <w:pStyle w:val="ListBullet"/>
+        <w:spacing w:after="40" w:afterAutospacing="0" w:before="0" w:lineRule="auto" w:line="252"/>
+        <w:ind/>
+      </w:pPr>
+      <w:r>
+        <w:rPr>
+          <w:rFonts w:ascii="Arial" w:hAnsi="Arial" w:eastAsia="Arial" w:cs="Arial"/>
+          <w:color w:val="111111"/>
+          <w:rtl w:val="0"/>
+        </w:rPr>
+        <w:t xml:space="preserve">Describe the goals and structure of STARLAB.</w:t>
+      </w:r>
+    </w:p>
+    <w:p>
+      <w:pPr>
+        <w:keepNext w:val="0"/>
+        <w:widowControl/>
+        <w:numPr>
+          <w:ilvl w:val="0"/>
+          <w:numId w:val="73"/>
+        </w:numPr>
+        <w:pStyle w:val="ListBullet"/>
+        <w:spacing w:after="40" w:afterAutospacing="0" w:before="0" w:beforeAutospacing="0" w:lineRule="auto" w:line="252"/>
+        <w:ind/>
+      </w:pPr>
+      <w:r>
+        <w:rPr>
+          <w:rFonts w:ascii="Arial" w:hAnsi="Arial" w:eastAsia="Arial" w:cs="Arial"/>
+          <w:color w:val="111111"/>
+          <w:rtl w:val="0"/>
+        </w:rPr>
+        <w:t xml:space="preserve">Explain the difference between a classroom lab and authentic research.</w:t>
+      </w:r>
+    </w:p>
+    <w:p>
+      <w:pPr>
+        <w:keepNext w:val="0"/>
+        <w:widowControl/>
+        <w:numPr>
+          <w:ilvl w:val="0"/>
+          <w:numId w:val="73"/>
+        </w:numPr>
+        <w:pStyle w:val="ListBullet"/>
+        <w:spacing w:after="40" w:afterAutospacing="0" w:before="0" w:beforeAutospacing="0" w:lineRule="auto" w:line="252"/>
+        <w:ind/>
+      </w:pPr>
+      <w:r>
+        <w:rPr>
+          <w:rFonts w:ascii="Arial" w:hAnsi="Arial" w:eastAsia="Arial" w:cs="Arial"/>
+          <w:color w:val="111111"/>
+          <w:rtl w:val="0"/>
+        </w:rPr>
+        <w:t xml:space="preserve">Reflect on their own interests, skills, and potential research directions.</w:t>
+      </w:r>
+    </w:p>
+    <w:p>
+      <w:pPr>
+        <w:keepNext w:val="0"/>
+        <w:widowControl/>
+        <w:numPr>
+          <w:ilvl w:val="0"/>
+          <w:numId w:val="73"/>
+        </w:numPr>
+        <w:pStyle w:val="ListBullet"/>
+        <w:spacing w:after="40" w:afterAutospacing="0" w:before="0" w:beforeAutospacing="0" w:lineRule="auto" w:line="252"/>
+        <w:ind/>
+      </w:pPr>
+      <w:r>
+        <w:rPr>
+          <w:rFonts w:ascii="Arial" w:hAnsi="Arial" w:eastAsia="Arial" w:cs="Arial"/>
+          <w:color w:val="111111"/>
+          <w:rtl w:val="0"/>
+        </w:rPr>
+        <w:t xml:space="preserve">Identify basic ethical responsibilities of student researchers.</w:t>
+      </w:r>
+    </w:p>
+    <w:p>
+      <w:pPr>
+        <w:keepNext w:val="0"/>
+        <w:widowControl/>
+        <w:numPr>
+          <w:ilvl w:val="0"/>
+          <w:numId w:val="73"/>
+        </w:numPr>
+        <w:pStyle w:val="ListBullet"/>
+        <w:spacing w:after="40" w:before="0" w:beforeAutospacing="0" w:lineRule="auto" w:line="252"/>
+        <w:ind/>
+      </w:pPr>
+      <w:r>
+        <w:rPr>
+          <w:rFonts w:ascii="Arial" w:hAnsi="Arial" w:eastAsia="Arial" w:cs="Arial"/>
+          <w:color w:val="111111"/>
+          <w:rtl w:val="0"/>
+        </w:rPr>
+        <w:t xml:space="preserve">Generate a broad list of possible research fields and topics.</w:t>
+      </w:r>
+    </w:p>
+    <w:p>
+      <w:pPr>
         <w:pStyle w:val="Heading2"/>
-        <w:keepNext w:val="0"/>
+        <w:keepNext/>
         <w:keepLines w:val="0"/>
-        <w:spacing w:after="80" w:lineRule="auto"/>
-        <w:rPr>
+        <w:widowControl/>
+        <w:spacing w:after="80" w:lineRule="auto" w:before="220" w:line="240"/>
+        <w:rPr>
+          <w:rFonts w:ascii="Arial" w:hAnsi="Arial" w:eastAsia="Arial" w:cs="Arial"/>
           <w:b w:val="1"/>
           <w:bCs w:val="1"/>
           <w:sz w:val="34"/>
           <w:szCs w:val="34"/>
         </w:rPr>
       </w:pPr>
-      <w:bookmarkStart w:colFirst="0" w:colLast="0" w:name="_9lw8c3ujmhuf" w:id="14"/>
-      <w:bookmarkEnd w:id="14"/>
+      <w:bookmarkStart w:colFirst="0" w:colLast="0" w:name="_vpknljyp7gd8" w:id="15"/>
+      <w:bookmarkEnd w:id="15"/>
       <w:r>
         <w:rPr>
+          <w:rFonts w:ascii="Arial" w:hAnsi="Arial" w:eastAsia="Arial" w:cs="Arial"/>
+          <w:b/>
+          <w:bCs w:val="1"/>
+          <w:color w:val="E31B23"/>
+          <w:sz w:val="34"/>
+          <w:szCs w:val="34"/>
+          <w:rtl w:val="0"/>
+        </w:rPr>
+        <w:t xml:space="preserve">Teacher Materials</w:t>
+      </w:r>
+    </w:p>
+    <w:p>
+      <w:pPr>
+        <w:pStyle w:val="STARLABDeckUse"/>
+        <w:shd w:val="clear" w:color="auto" w:fill="F2F2F2"/>
+        <w:keepNext w:val="0"/>
+        <w:widowControl/>
+        <w:pBdr>
+          <w:left w:val="single" w:sz="18" w:space="6" w:color="E31B23"/>
+        </w:pBdr>
+        <w:spacing w:before="40" w:after="140" w:line="252" w:lineRule="auto"/>
+      </w:pPr>
+      <w:r>
+        <w:rPr>
+          <w:rFonts w:ascii="Arial" w:hAnsi="Arial"/>
+          <w:color w:val="111111"/>
+        </w:rPr>
+        <w:t>Deck Use: Primary - Deck 1: Authentic Research and Course Launch; Deck 3: Research Ethics, Safety, and Integrity</w:t>
+      </w:r>
+    </w:p>
+    <w:p>
+      <w:pPr>
+        <w:keepNext w:val="0"/>
+        <w:widowControl/>
+        <w:numPr>
+          <w:ilvl w:val="0"/>
+          <w:numId w:val="73"/>
+        </w:numPr>
+        <w:pStyle w:val="ListBullet"/>
+        <w:spacing w:after="40" w:afterAutospacing="0" w:before="0" w:lineRule="auto" w:line="252"/>
+        <w:ind/>
+      </w:pPr>
+      <w:r>
+        <w:rPr>
+          <w:rFonts w:ascii="Arial" w:hAnsi="Arial" w:eastAsia="Arial" w:cs="Arial"/>
+          <w:color w:val="111111"/>
+          <w:rtl w:val="0"/>
+        </w:rPr>
+        <w:t xml:space="preserve">STARLAB syllabus or course overview</w:t>
+      </w:r>
+    </w:p>
+    <w:p>
+      <w:pPr>
+        <w:keepNext w:val="0"/>
+        <w:widowControl/>
+        <w:numPr>
+          <w:ilvl w:val="0"/>
+          <w:numId w:val="73"/>
+        </w:numPr>
+        <w:pStyle w:val="ListBullet"/>
+        <w:spacing w:after="40" w:afterAutospacing="0" w:before="0" w:beforeAutospacing="0" w:lineRule="auto" w:line="252"/>
+        <w:ind/>
+      </w:pPr>
+      <w:r>
+        <w:rPr>
+          <w:rFonts w:ascii="Arial" w:hAnsi="Arial" w:eastAsia="Arial" w:cs="Arial"/>
+          <w:color w:val="111111"/>
+          <w:rtl w:val="0"/>
+        </w:rPr>
+        <w:t xml:space="preserve">Student Handout 1: STARLAB Course Launch Reflection</w:t>
+      </w:r>
+    </w:p>
+    <w:p>
+      <w:pPr>
+        <w:keepNext w:val="0"/>
+        <w:widowControl/>
+        <w:numPr>
+          <w:ilvl w:val="0"/>
+          <w:numId w:val="73"/>
+        </w:numPr>
+        <w:pStyle w:val="ListBullet"/>
+        <w:spacing w:after="40" w:afterAutospacing="0" w:before="0" w:beforeAutospacing="0" w:lineRule="auto" w:line="252"/>
+        <w:ind/>
+      </w:pPr>
+      <w:r>
+        <w:rPr>
+          <w:rFonts w:ascii="Arial" w:hAnsi="Arial" w:eastAsia="Arial" w:cs="Arial"/>
+          <w:color w:val="111111"/>
+          <w:rtl w:val="0"/>
+        </w:rPr>
+        <w:t xml:space="preserve">Student Handout 2: Science Identity and Skills Inventory</w:t>
+      </w:r>
+    </w:p>
+    <w:p>
+      <w:pPr>
+        <w:keepNext w:val="0"/>
+        <w:widowControl/>
+        <w:numPr>
+          <w:ilvl w:val="0"/>
+          <w:numId w:val="73"/>
+        </w:numPr>
+        <w:pStyle w:val="ListBullet"/>
+        <w:spacing w:after="40" w:afterAutospacing="0" w:before="0" w:beforeAutospacing="0" w:lineRule="auto" w:line="252"/>
+        <w:ind/>
+      </w:pPr>
+      <w:r>
+        <w:rPr>
+          <w:rFonts w:ascii="Arial" w:hAnsi="Arial" w:eastAsia="Arial" w:cs="Arial"/>
+          <w:color w:val="111111"/>
+          <w:rtl w:val="0"/>
+        </w:rPr>
+        <w:t xml:space="preserve">Student Handout 3: Research Interest Inventory</w:t>
+      </w:r>
+    </w:p>
+    <w:p>
+      <w:pPr>
+        <w:keepNext w:val="0"/>
+        <w:widowControl/>
+        <w:numPr>
+          <w:ilvl w:val="0"/>
+          <w:numId w:val="73"/>
+        </w:numPr>
+        <w:pStyle w:val="ListBullet"/>
+        <w:spacing w:after="40" w:afterAutospacing="0" w:before="0" w:beforeAutospacing="0" w:lineRule="auto" w:line="252"/>
+        <w:ind/>
+      </w:pPr>
+      <w:r>
+        <w:rPr>
+          <w:rFonts w:ascii="Arial" w:hAnsi="Arial" w:eastAsia="Arial" w:cs="Arial"/>
+          <w:color w:val="111111"/>
+          <w:rtl w:val="0"/>
+        </w:rPr>
+        <w:t xml:space="preserve">Student Handout 4: Research Ethics and Integrity Agreement</w:t>
+      </w:r>
+    </w:p>
+    <w:p>
+      <w:pPr>
+        <w:keepNext w:val="0"/>
+        <w:widowControl/>
+        <w:numPr>
+          <w:ilvl w:val="0"/>
+          <w:numId w:val="73"/>
+        </w:numPr>
+        <w:pStyle w:val="ListBullet"/>
+        <w:spacing w:after="40" w:afterAutospacing="0" w:before="0" w:beforeAutospacing="0" w:lineRule="auto" w:line="252"/>
+        <w:ind/>
+      </w:pPr>
+      <w:r>
+        <w:rPr>
+          <w:rFonts w:ascii="Arial" w:hAnsi="Arial" w:eastAsia="Arial" w:cs="Arial"/>
+          <w:color w:val="111111"/>
+          <w:rtl w:val="0"/>
+        </w:rPr>
+        <w:t xml:space="preserve">Appendix A: What Counts as Research?</w:t>
+      </w:r>
+    </w:p>
+    <w:p>
+      <w:pPr>
+        <w:keepNext w:val="0"/>
+        <w:widowControl/>
+        <w:numPr>
+          <w:ilvl w:val="0"/>
+          <w:numId w:val="73"/>
+        </w:numPr>
+        <w:pStyle w:val="ListBullet"/>
+        <w:spacing w:after="40" w:afterAutospacing="0" w:before="0" w:beforeAutospacing="0" w:lineRule="auto" w:line="252"/>
+        <w:ind/>
+      </w:pPr>
+      <w:r>
+        <w:rPr>
+          <w:rFonts w:ascii="Arial" w:hAnsi="Arial" w:eastAsia="Arial" w:cs="Arial"/>
+          <w:color w:val="111111"/>
+          <w:rtl w:val="0"/>
+        </w:rPr>
+        <w:t xml:space="preserve">Appendix B: STARLAB Classroom Norms</w:t>
+      </w:r>
+    </w:p>
+    <w:p>
+      <w:pPr>
+        <w:keepNext w:val="0"/>
+        <w:widowControl/>
+        <w:numPr>
+          <w:ilvl w:val="0"/>
+          <w:numId w:val="73"/>
+        </w:numPr>
+        <w:pStyle w:val="ListBullet"/>
+        <w:spacing w:after="40" w:before="0" w:beforeAutospacing="0" w:lineRule="auto" w:line="252"/>
+        <w:ind/>
+      </w:pPr>
+      <w:r>
+        <w:rPr>
+          <w:rFonts w:ascii="Arial" w:hAnsi="Arial" w:eastAsia="Arial" w:cs="Arial"/>
+          <w:color w:val="111111"/>
+          <w:rtl w:val="0"/>
+        </w:rPr>
+        <w:t xml:space="preserve">Appendix C: Research Fields and Topic Bank</w:t>
+      </w:r>
+    </w:p>
+    <w:p>
+      <w:pPr>
+        <w:keepNext w:val="0"/>
+        <w:widowControl/>
+        <w:numPr>
+          <w:ilvl w:val="0"/>
+          <w:numId w:val="73"/>
+        </w:numPr>
+        <w:pStyle w:val="ListBullet"/>
+        <w:spacing w:before="0" w:after="40" w:line="252" w:lineRule="auto"/>
+      </w:pPr>
+      <w:r>
+        <w:rPr>
+          <w:rFonts w:ascii="Arial" w:hAnsi="Arial"/>
+          <w:color w:val="111111"/>
+        </w:rPr>
+        <w:t>Optional / Teacher Reference - Appendix I: Optional Project Card Sorting Activity</w:t>
+      </w:r>
+    </w:p>
+    <w:p>
+      <w:pPr>
+        <w:keepNext w:val="0"/>
+        <w:widowControl/>
+        <w:numPr>
+          <w:ilvl w:val="0"/>
+          <w:numId w:val="73"/>
+        </w:numPr>
+        <w:pStyle w:val="ListBullet"/>
+        <w:spacing w:before="0" w:after="40" w:line="252" w:lineRule="auto"/>
+      </w:pPr>
+      <w:r>
+        <w:rPr>
+          <w:rFonts w:ascii="Arial" w:hAnsi="Arial"/>
+          <w:color w:val="111111"/>
+        </w:rPr>
+        <w:t>Optional / Teacher Reference - Appendix J: Optional Initial Parent or Guardian Communication</w:t>
+      </w:r>
+    </w:p>
+    <w:p>
+      <w:pPr>
+        <w:keepNext w:val="0"/>
+        <w:widowControl/>
+        <w:numPr>
+          <w:ilvl w:val="0"/>
+          <w:numId w:val="73"/>
+        </w:numPr>
+        <w:pStyle w:val="ListBullet"/>
+        <w:spacing w:before="0" w:after="40" w:line="252" w:lineRule="auto"/>
+      </w:pPr>
+      <w:r>
+        <w:rPr>
+          <w:rFonts w:ascii="Arial" w:hAnsi="Arial"/>
+          <w:color w:val="111111"/>
+        </w:rPr>
+        <w:t>Optional / Teacher Reference - Appendix L: Differentiation and Implementation Notes</w:t>
+      </w:r>
+    </w:p>
+    <w:p>
+      <w:pPr>
+        <w:pStyle w:val="Heading2"/>
+        <w:keepNext/>
+        <w:keepLines w:val="0"/>
+        <w:widowControl/>
+        <w:spacing w:after="80" w:lineRule="auto" w:before="220" w:line="240"/>
+        <w:rPr>
+          <w:rFonts w:ascii="Arial" w:hAnsi="Arial" w:eastAsia="Arial" w:cs="Arial"/>
           <w:b w:val="1"/>
           <w:bCs w:val="1"/>
           <w:sz w:val="34"/>
           <w:szCs w:val="34"/>
+        </w:rPr>
+      </w:pPr>
+      <w:bookmarkStart w:colFirst="0" w:colLast="0" w:name="_l0nqib5vt55f" w:id="16"/>
+      <w:bookmarkEnd w:id="16"/>
+      <w:r>
+        <w:rPr>
+          <w:rFonts w:ascii="Arial" w:hAnsi="Arial" w:eastAsia="Arial" w:cs="Arial"/>
+          <w:b/>
+          <w:bCs w:val="1"/>
+          <w:color w:val="E31B23"/>
+          <w:sz w:val="34"/>
+          <w:szCs w:val="34"/>
           <w:rtl w:val="0"/>
         </w:rPr>
-        <w:t xml:space="preserve">Weekly Objectives</w:t>
+        <w:t xml:space="preserve">Suggested Weekly Flow</w:t>
       </w:r>
     </w:p>
     <w:p>
       <w:pPr>
-        <w:spacing w:after="240" w:before="240" w:lineRule="auto"/>
-        <w:rPr/>
-      </w:pPr>
+        <w:pStyle w:val="Heading3"/>
+        <w:keepNext/>
+        <w:keepLines w:val="0"/>
+        <w:widowControl/>
+        <w:spacing w:before="140" w:lineRule="auto" w:after="40" w:line="240"/>
+        <w:rPr>
+          <w:rFonts w:ascii="Arial" w:hAnsi="Arial" w:eastAsia="Arial" w:cs="Arial"/>
+          <w:b w:val="1"/>
+          <w:bCs w:val="1"/>
+          <w:sz w:val="26"/>
+          <w:szCs w:val="26"/>
+        </w:rPr>
+      </w:pPr>
+      <w:bookmarkStart w:colFirst="0" w:colLast="0" w:name="_9gtt5xbhjinc" w:id="17"/>
+      <w:bookmarkEnd w:id="17"/>
       <w:r>
         <w:rPr>
+          <w:rFonts w:ascii="Arial" w:hAnsi="Arial" w:eastAsia="Arial" w:cs="Arial"/>
+          <w:b/>
+          <w:bCs w:val="1"/>
+          <w:color w:val="111111"/>
+          <w:sz w:val="26"/>
+          <w:szCs w:val="26"/>
           <w:rtl w:val="0"/>
         </w:rPr>
-        <w:t xml:space="preserve">Students will be able to:</w:t>
+        <w:t xml:space="preserve">Day 1: Course Launch — What Is STARLAB?</w:t>
       </w:r>
     </w:p>
     <w:p>
       <w:pPr>
-        <w:numPr>
-          <w:ilvl w:val="0"/>
-          <w:numId w:val="35"/>
-        </w:numPr>
-        <w:spacing w:after="0" w:afterAutospacing="0" w:before="240" w:lineRule="auto"/>
-        <w:ind w:left="720" w:hanging="360"/>
+        <w:keepNext w:val="0"/>
+        <w:widowControl/>
+        <w:spacing w:after="80" w:before="0" w:lineRule="auto" w:line="252"/>
+        <w:rPr>
+          <w:rFonts w:ascii="Arial" w:hAnsi="Arial" w:eastAsia="Arial" w:cs="Arial"/>
+        </w:rPr>
       </w:pPr>
       <w:r>
         <w:rPr>
+          <w:rFonts w:ascii="Arial" w:hAnsi="Arial" w:eastAsia="Arial" w:cs="Arial"/>
+          <w:color w:val="111111"/>
           <w:rtl w:val="0"/>
         </w:rPr>
-        <w:t xml:space="preserve">Describe the goals and structure of STARLAB.</w:t>
+        <w:t xml:space="preserve">Begin with a short teacher introduction to the purpose of STARLAB. Emphasize that students will spend the year developing and communicating an original research or engineering project. STARLAB should be framed as a bridge between high school science and authentic scientific or engineering practice.</w:t>
       </w:r>
     </w:p>
     <w:p>
       <w:pPr>
-        <w:numPr>
-          <w:ilvl w:val="0"/>
-          <w:numId w:val="35"/>
-        </w:numPr>
-        <w:spacing w:after="0" w:afterAutospacing="0" w:before="0" w:beforeAutospacing="0" w:lineRule="auto"/>
-        <w:ind w:left="720" w:hanging="360"/>
+        <w:keepNext w:val="0"/>
+        <w:widowControl/>
+        <w:spacing w:after="80" w:before="0" w:lineRule="auto" w:line="252"/>
+        <w:rPr>
+          <w:rFonts w:ascii="Arial" w:hAnsi="Arial" w:eastAsia="Arial" w:cs="Arial"/>
+        </w:rPr>
       </w:pPr>
       <w:r>
         <w:rPr>
+          <w:rFonts w:ascii="Arial" w:hAnsi="Arial" w:eastAsia="Arial" w:cs="Arial"/>
+          <w:color w:val="111111"/>
           <w:rtl w:val="0"/>
         </w:rPr>
-        <w:t xml:space="preserve">Explain the difference between a classroom lab and authentic research.</w:t>
+        <w:t xml:space="preserve">Suggested teacher framing:</w:t>
       </w:r>
     </w:p>
     <w:p>
       <w:pPr>
-        <w:numPr>
-          <w:ilvl w:val="0"/>
-          <w:numId w:val="35"/>
-        </w:numPr>
-        <w:spacing w:after="0" w:afterAutospacing="0" w:before="0" w:beforeAutospacing="0" w:lineRule="auto"/>
-        <w:ind w:left="720" w:hanging="360"/>
+        <w:keepNext w:val="0"/>
+        <w:widowControl/>
+        <w:spacing w:after="80" w:before="0" w:lineRule="auto" w:line="252"/>
+        <w:rPr>
+          <w:rFonts w:ascii="Arial" w:hAnsi="Arial" w:eastAsia="Arial" w:cs="Arial"/>
+        </w:rPr>
       </w:pPr>
       <w:r>
         <w:rPr>
+          <w:rFonts w:ascii="Arial" w:hAnsi="Arial" w:eastAsia="Arial" w:cs="Arial"/>
+          <w:color w:val="111111"/>
           <w:rtl w:val="0"/>
         </w:rPr>
-        <w:t xml:space="preserve">Reflect on their own interests, skills, and potential research directions.</w:t>
+        <w:t xml:space="preserve">“STARLAB is not a course where I give everyone the same lab and everyone knows the correct answer before starting. This course is about learning how to ask better questions, design better investigations, work through uncertainty, and communicate findings professionally. By the end of the course, your goal is not only to complete a project, but to understand your work well enough to explain and defend it.”</w:t>
       </w:r>
     </w:p>
     <w:p>
       <w:pPr>
-        <w:numPr>
-          <w:ilvl w:val="0"/>
-          <w:numId w:val="35"/>
-        </w:numPr>
-        <w:spacing w:after="0" w:afterAutospacing="0" w:before="0" w:beforeAutospacing="0" w:lineRule="auto"/>
-        <w:ind w:left="720" w:hanging="360"/>
+        <w:keepNext w:val="0"/>
+        <w:widowControl/>
+        <w:spacing w:after="80" w:before="0" w:lineRule="auto" w:line="252"/>
+        <w:rPr>
+          <w:rFonts w:ascii="Arial" w:hAnsi="Arial" w:eastAsia="Arial" w:cs="Arial"/>
+        </w:rPr>
       </w:pPr>
       <w:r>
         <w:rPr>
+          <w:rFonts w:ascii="Arial" w:hAnsi="Arial" w:eastAsia="Arial" w:cs="Arial"/>
+          <w:color w:val="111111"/>
           <w:rtl w:val="0"/>
         </w:rPr>
-        <w:t xml:space="preserve">Identify basic ethical responsibilities of student researchers.</w:t>
+        <w:t xml:space="preserve">Give students a brief overview of the yearlong arc:</w:t>
       </w:r>
     </w:p>
     <w:p>
       <w:pPr>
+        <w:keepNext w:val="0"/>
+        <w:widowControl/>
         <w:numPr>
           <w:ilvl w:val="0"/>
-          <w:numId w:val="35"/>
+          <w:numId w:val="34"/>
         </w:numPr>
-        <w:spacing w:after="240" w:before="0" w:beforeAutospacing="0" w:lineRule="auto"/>
+        <w:spacing w:after="80" w:afterAutospacing="0" w:before="0" w:lineRule="auto" w:line="252"/>
         <w:ind w:left="720" w:hanging="360"/>
       </w:pPr>
       <w:r>
         <w:rPr>
+          <w:rFonts w:ascii="Arial" w:hAnsi="Arial" w:eastAsia="Arial" w:cs="Arial"/>
+          <w:color w:val="111111"/>
           <w:rtl w:val="0"/>
         </w:rPr>
-        <w:t xml:space="preserve">Generate a broad list of possible research fields and topics.</w:t>
+        <w:t xml:space="preserve">Research foundations and question development</w:t>
       </w:r>
     </w:p>
     <w:p>
       <w:pPr>
+        <w:keepNext w:val="0"/>
+        <w:widowControl/>
+        <w:numPr>
+          <w:ilvl w:val="0"/>
+          <w:numId w:val="34"/>
+        </w:numPr>
+        <w:spacing w:after="80" w:afterAutospacing="0" w:before="0" w:beforeAutospacing="0" w:lineRule="auto" w:line="252"/>
+        <w:ind w:left="720" w:hanging="360"/>
+      </w:pPr>
+      <w:r>
+        <w:rPr>
+          <w:rFonts w:ascii="Arial" w:hAnsi="Arial" w:eastAsia="Arial" w:cs="Arial"/>
+          <w:color w:val="111111"/>
+          <w:rtl w:val="0"/>
+        </w:rPr>
+        <w:t xml:space="preserve">Project planning and safety</w:t>
+      </w:r>
+    </w:p>
+    <w:p>
+      <w:pPr>
+        <w:keepNext w:val="0"/>
+        <w:widowControl/>
+        <w:numPr>
+          <w:ilvl w:val="0"/>
+          <w:numId w:val="34"/>
+        </w:numPr>
+        <w:spacing w:after="80" w:afterAutospacing="0" w:before="0" w:beforeAutospacing="0" w:lineRule="auto" w:line="252"/>
+        <w:ind w:left="720" w:hanging="360"/>
+      </w:pPr>
+      <w:r>
+        <w:rPr>
+          <w:rFonts w:ascii="Arial" w:hAnsi="Arial" w:eastAsia="Arial" w:cs="Arial"/>
+          <w:color w:val="111111"/>
+          <w:rtl w:val="0"/>
+        </w:rPr>
+        <w:t xml:space="preserve">Pilot testing and data collection</w:t>
+      </w:r>
+    </w:p>
+    <w:p>
+      <w:pPr>
+        <w:keepNext w:val="0"/>
+        <w:widowControl/>
+        <w:numPr>
+          <w:ilvl w:val="0"/>
+          <w:numId w:val="34"/>
+        </w:numPr>
+        <w:spacing w:after="80" w:afterAutospacing="0" w:before="0" w:beforeAutospacing="0" w:lineRule="auto" w:line="252"/>
+        <w:ind w:left="720" w:hanging="360"/>
+      </w:pPr>
+      <w:r>
+        <w:rPr>
+          <w:rFonts w:ascii="Arial" w:hAnsi="Arial" w:eastAsia="Arial" w:cs="Arial"/>
+          <w:color w:val="111111"/>
+          <w:rtl w:val="0"/>
+        </w:rPr>
+        <w:t xml:space="preserve">Data analysis and interpretation</w:t>
+      </w:r>
+    </w:p>
+    <w:p>
+      <w:pPr>
+        <w:keepNext w:val="0"/>
+        <w:widowControl/>
+        <w:numPr>
+          <w:ilvl w:val="0"/>
+          <w:numId w:val="34"/>
+        </w:numPr>
+        <w:spacing w:after="80" w:afterAutospacing="0" w:before="0" w:beforeAutospacing="0" w:lineRule="auto" w:line="252"/>
+        <w:ind w:left="720" w:hanging="360"/>
+      </w:pPr>
+      <w:r>
+        <w:rPr>
+          <w:rFonts w:ascii="Arial" w:hAnsi="Arial" w:eastAsia="Arial" w:cs="Arial"/>
+          <w:color w:val="111111"/>
+          <w:rtl w:val="0"/>
+        </w:rPr>
+        <w:t xml:space="preserve">Scientific reporting and presentation preparation</w:t>
+      </w:r>
+    </w:p>
+    <w:p>
+      <w:pPr>
+        <w:keepNext w:val="0"/>
+        <w:widowControl/>
+        <w:numPr>
+          <w:ilvl w:val="0"/>
+          <w:numId w:val="34"/>
+        </w:numPr>
+        <w:spacing w:after="80" w:before="0" w:beforeAutospacing="0" w:lineRule="auto" w:line="252"/>
+        <w:ind w:left="720" w:hanging="360"/>
+      </w:pPr>
+      <w:r>
+        <w:rPr>
+          <w:rFonts w:ascii="Arial" w:hAnsi="Arial" w:eastAsia="Arial" w:cs="Arial"/>
+          <w:color w:val="111111"/>
+          <w:rtl w:val="0"/>
+        </w:rPr>
+        <w:t xml:space="preserve">Public presentation and reflection</w:t>
+      </w:r>
+    </w:p>
+    <w:p>
+      <w:pPr>
+        <w:keepNext w:val="0"/>
+        <w:widowControl/>
+        <w:spacing w:after="80" w:before="0" w:lineRule="auto" w:line="252"/>
+        <w:rPr>
+          <w:rFonts w:ascii="Arial" w:hAnsi="Arial" w:eastAsia="Arial" w:cs="Arial"/>
+        </w:rPr>
+      </w:pPr>
+      <w:r>
+        <w:rPr>
+          <w:rFonts w:ascii="Arial" w:hAnsi="Arial" w:eastAsia="Arial" w:cs="Arial"/>
+          <w:color w:val="111111"/>
+          <w:rtl w:val="0"/>
+        </w:rPr>
+        <w:t xml:space="preserve">Students complete Student Handout 1: STARLAB Course Launch Reflection.</w:t>
+      </w:r>
+    </w:p>
+    <w:p>
+      <w:pPr>
+        <w:keepNext w:val="0"/>
+        <w:widowControl/>
+        <w:spacing w:after="80" w:before="0" w:lineRule="auto" w:line="252"/>
+        <w:rPr>
+          <w:rFonts w:ascii="Arial" w:hAnsi="Arial" w:eastAsia="Arial" w:cs="Arial"/>
+        </w:rPr>
+      </w:pPr>
+      <w:r>
+        <w:rPr>
+          <w:rFonts w:ascii="Arial" w:hAnsi="Arial" w:eastAsia="Arial" w:cs="Arial"/>
+          <w:color w:val="111111"/>
+          <w:rtl w:val="0"/>
+        </w:rPr>
+        <w:t xml:space="preserve">Discussion questions:</w:t>
+      </w:r>
+    </w:p>
+    <w:p>
+      <w:pPr>
+        <w:keepNext w:val="0"/>
+        <w:widowControl/>
+        <w:numPr>
+          <w:ilvl w:val="0"/>
+          <w:numId w:val="67"/>
+        </w:numPr>
+        <w:spacing w:after="80" w:afterAutospacing="0" w:before="0" w:lineRule="auto" w:line="252"/>
+        <w:ind w:left="720" w:hanging="360"/>
+      </w:pPr>
+      <w:r>
+        <w:rPr>
+          <w:rFonts w:ascii="Arial" w:hAnsi="Arial" w:eastAsia="Arial" w:cs="Arial"/>
+          <w:color w:val="111111"/>
+          <w:rtl w:val="0"/>
+        </w:rPr>
+        <w:t xml:space="preserve">What parts of this course sound exciting?</w:t>
+      </w:r>
+    </w:p>
+    <w:p>
+      <w:pPr>
+        <w:keepNext w:val="0"/>
+        <w:widowControl/>
+        <w:numPr>
+          <w:ilvl w:val="0"/>
+          <w:numId w:val="67"/>
+        </w:numPr>
+        <w:spacing w:after="80" w:afterAutospacing="0" w:before="0" w:beforeAutospacing="0" w:lineRule="auto" w:line="252"/>
+        <w:ind w:left="720" w:hanging="360"/>
+      </w:pPr>
+      <w:r>
+        <w:rPr>
+          <w:rFonts w:ascii="Arial" w:hAnsi="Arial" w:eastAsia="Arial" w:cs="Arial"/>
+          <w:color w:val="111111"/>
+          <w:rtl w:val="0"/>
+        </w:rPr>
+        <w:t xml:space="preserve">What parts sound intimidating?</w:t>
+      </w:r>
+    </w:p>
+    <w:p>
+      <w:pPr>
+        <w:keepNext w:val="0"/>
+        <w:widowControl/>
+        <w:numPr>
+          <w:ilvl w:val="0"/>
+          <w:numId w:val="67"/>
+        </w:numPr>
+        <w:spacing w:after="80" w:afterAutospacing="0" w:before="0" w:beforeAutospacing="0" w:lineRule="auto" w:line="252"/>
+        <w:ind w:left="720" w:hanging="360"/>
+      </w:pPr>
+      <w:r>
+        <w:rPr>
+          <w:rFonts w:ascii="Arial" w:hAnsi="Arial" w:eastAsia="Arial" w:cs="Arial"/>
+          <w:color w:val="111111"/>
+          <w:rtl w:val="0"/>
+        </w:rPr>
+        <w:t xml:space="preserve">What does it mean to work on a project where the teacher does not already know the answer?</w:t>
+      </w:r>
+    </w:p>
+    <w:p>
+      <w:pPr>
+        <w:keepNext w:val="0"/>
+        <w:widowControl/>
+        <w:numPr>
+          <w:ilvl w:val="0"/>
+          <w:numId w:val="67"/>
+        </w:numPr>
+        <w:spacing w:after="80" w:before="0" w:beforeAutospacing="0" w:lineRule="auto" w:line="252"/>
+        <w:ind w:left="720" w:hanging="360"/>
+      </w:pPr>
+      <w:r>
+        <w:rPr>
+          <w:rFonts w:ascii="Arial" w:hAnsi="Arial" w:eastAsia="Arial" w:cs="Arial"/>
+          <w:color w:val="111111"/>
+          <w:rtl w:val="0"/>
+        </w:rPr>
+        <w:t xml:space="preserve">How should students support one another in a research-based class?</w:t>
+      </w:r>
+    </w:p>
+    <w:p>
+      <w:pPr>
+        <w:pStyle w:val="Heading3"/>
+        <w:keepNext/>
+        <w:keepLines w:val="0"/>
+        <w:widowControl/>
+        <w:spacing w:before="140" w:lineRule="auto" w:after="40" w:line="240"/>
+        <w:rPr>
+          <w:rFonts w:ascii="Arial" w:hAnsi="Arial" w:eastAsia="Arial" w:cs="Arial"/>
+          <w:b w:val="1"/>
+          <w:bCs w:val="1"/>
+          <w:sz w:val="26"/>
+          <w:szCs w:val="26"/>
+        </w:rPr>
+      </w:pPr>
+      <w:bookmarkStart w:colFirst="0" w:colLast="0" w:name="_1jwcej3q38zb" w:id="18"/>
+      <w:bookmarkEnd w:id="18"/>
+      <w:r>
+        <w:rPr>
+          <w:rFonts w:ascii="Arial" w:hAnsi="Arial" w:eastAsia="Arial" w:cs="Arial"/>
+          <w:b/>
+          <w:bCs w:val="1"/>
+          <w:color w:val="111111"/>
+          <w:sz w:val="26"/>
+          <w:szCs w:val="26"/>
+          <w:rtl w:val="0"/>
+        </w:rPr>
+        <w:t xml:space="preserve">Day 2: What Counts as Scientific Research?</w:t>
+      </w:r>
+    </w:p>
+    <w:p>
+      <w:pPr>
+        <w:keepNext w:val="0"/>
+        <w:widowControl/>
+        <w:spacing w:after="80" w:before="0" w:lineRule="auto" w:line="252"/>
+        <w:rPr>
+          <w:rFonts w:ascii="Arial" w:hAnsi="Arial" w:eastAsia="Arial" w:cs="Arial"/>
+        </w:rPr>
+      </w:pPr>
+      <w:r>
+        <w:rPr>
+          <w:rFonts w:ascii="Arial" w:hAnsi="Arial" w:eastAsia="Arial" w:cs="Arial"/>
+          <w:color w:val="111111"/>
+          <w:rtl w:val="0"/>
+        </w:rPr>
+        <w:t xml:space="preserve">Use Appendix A to guide a discussion on the difference between demonstrations, classroom labs, engineering builds, science fair projects, and authentic research.</w:t>
+      </w:r>
+    </w:p>
+    <w:p>
+      <w:pPr>
+        <w:keepNext w:val="0"/>
+        <w:widowControl/>
+        <w:spacing w:after="80" w:before="0" w:lineRule="auto" w:line="252"/>
+        <w:rPr>
+          <w:rFonts w:ascii="Arial" w:hAnsi="Arial" w:eastAsia="Arial" w:cs="Arial"/>
+        </w:rPr>
+      </w:pPr>
+      <w:r>
+        <w:rPr>
+          <w:rFonts w:ascii="Arial" w:hAnsi="Arial" w:eastAsia="Arial" w:cs="Arial"/>
+          <w:color w:val="111111"/>
+          <w:rtl w:val="0"/>
+        </w:rPr>
+        <w:t xml:space="preserve">Students should understand that research can take many forms, including:</w:t>
+      </w:r>
+    </w:p>
+    <w:p>
+      <w:pPr>
+        <w:keepNext w:val="0"/>
+        <w:widowControl/>
+        <w:numPr>
+          <w:ilvl w:val="0"/>
+          <w:numId w:val="33"/>
+        </w:numPr>
+        <w:spacing w:after="80" w:afterAutospacing="0" w:before="0" w:lineRule="auto" w:line="252"/>
+        <w:ind w:left="720" w:hanging="360"/>
+      </w:pPr>
+      <w:r>
+        <w:rPr>
+          <w:rFonts w:ascii="Arial" w:hAnsi="Arial" w:eastAsia="Arial" w:cs="Arial"/>
+          <w:color w:val="111111"/>
+          <w:rtl w:val="0"/>
+        </w:rPr>
+        <w:t xml:space="preserve">Controlled experiments</w:t>
+      </w:r>
+    </w:p>
+    <w:p>
+      <w:pPr>
+        <w:keepNext w:val="0"/>
+        <w:widowControl/>
+        <w:numPr>
+          <w:ilvl w:val="0"/>
+          <w:numId w:val="33"/>
+        </w:numPr>
+        <w:spacing w:after="80" w:afterAutospacing="0" w:before="0" w:beforeAutospacing="0" w:lineRule="auto" w:line="252"/>
+        <w:ind w:left="720" w:hanging="360"/>
+      </w:pPr>
+      <w:r>
+        <w:rPr>
+          <w:rFonts w:ascii="Arial" w:hAnsi="Arial" w:eastAsia="Arial" w:cs="Arial"/>
+          <w:color w:val="111111"/>
+          <w:rtl w:val="0"/>
+        </w:rPr>
+        <w:t xml:space="preserve">Engineering design and testing</w:t>
+      </w:r>
+    </w:p>
+    <w:p>
+      <w:pPr>
+        <w:keepNext w:val="0"/>
+        <w:widowControl/>
+        <w:numPr>
+          <w:ilvl w:val="0"/>
+          <w:numId w:val="33"/>
+        </w:numPr>
+        <w:spacing w:after="80" w:afterAutospacing="0" w:before="0" w:beforeAutospacing="0" w:lineRule="auto" w:line="252"/>
+        <w:ind w:left="720" w:hanging="360"/>
+      </w:pPr>
+      <w:r>
+        <w:rPr>
+          <w:rFonts w:ascii="Arial" w:hAnsi="Arial" w:eastAsia="Arial" w:cs="Arial"/>
+          <w:color w:val="111111"/>
+          <w:rtl w:val="0"/>
+        </w:rPr>
+        <w:t xml:space="preserve">Computational modeling</w:t>
+      </w:r>
+    </w:p>
+    <w:p>
+      <w:pPr>
+        <w:keepNext w:val="0"/>
+        <w:widowControl/>
+        <w:numPr>
+          <w:ilvl w:val="0"/>
+          <w:numId w:val="33"/>
+        </w:numPr>
+        <w:spacing w:after="80" w:afterAutospacing="0" w:before="0" w:beforeAutospacing="0" w:lineRule="auto" w:line="252"/>
+        <w:ind w:left="720" w:hanging="360"/>
+      </w:pPr>
+      <w:r>
+        <w:rPr>
+          <w:rFonts w:ascii="Arial" w:hAnsi="Arial" w:eastAsia="Arial" w:cs="Arial"/>
+          <w:color w:val="111111"/>
+          <w:rtl w:val="0"/>
+        </w:rPr>
+        <w:t xml:space="preserve">Field observations</w:t>
+      </w:r>
+    </w:p>
+    <w:p>
+      <w:pPr>
+        <w:keepNext w:val="0"/>
+        <w:widowControl/>
+        <w:numPr>
+          <w:ilvl w:val="0"/>
+          <w:numId w:val="33"/>
+        </w:numPr>
+        <w:spacing w:after="80" w:afterAutospacing="0" w:before="0" w:beforeAutospacing="0" w:lineRule="auto" w:line="252"/>
+        <w:ind w:left="720" w:hanging="360"/>
+      </w:pPr>
+      <w:r>
+        <w:rPr>
+          <w:rFonts w:ascii="Arial" w:hAnsi="Arial" w:eastAsia="Arial" w:cs="Arial"/>
+          <w:color w:val="111111"/>
+          <w:rtl w:val="0"/>
+        </w:rPr>
+        <w:t xml:space="preserve">Materials testing</w:t>
+      </w:r>
+    </w:p>
+    <w:p>
+      <w:pPr>
+        <w:keepNext w:val="0"/>
+        <w:widowControl/>
+        <w:numPr>
+          <w:ilvl w:val="0"/>
+          <w:numId w:val="33"/>
+        </w:numPr>
+        <w:spacing w:after="80" w:afterAutospacing="0" w:before="0" w:beforeAutospacing="0" w:lineRule="auto" w:line="252"/>
+        <w:ind w:left="720" w:hanging="360"/>
+      </w:pPr>
+      <w:r>
+        <w:rPr>
+          <w:rFonts w:ascii="Arial" w:hAnsi="Arial" w:eastAsia="Arial" w:cs="Arial"/>
+          <w:color w:val="111111"/>
+          <w:rtl w:val="0"/>
+        </w:rPr>
+        <w:t xml:space="preserve">Survey-based research, when ethically appropriate</w:t>
+      </w:r>
+    </w:p>
+    <w:p>
+      <w:pPr>
+        <w:keepNext w:val="0"/>
+        <w:widowControl/>
+        <w:numPr>
+          <w:ilvl w:val="0"/>
+          <w:numId w:val="33"/>
+        </w:numPr>
+        <w:spacing w:after="80" w:afterAutospacing="0" w:before="0" w:beforeAutospacing="0" w:lineRule="auto" w:line="252"/>
+        <w:ind w:left="720" w:hanging="360"/>
+      </w:pPr>
+      <w:r>
+        <w:rPr>
+          <w:rFonts w:ascii="Arial" w:hAnsi="Arial" w:eastAsia="Arial" w:cs="Arial"/>
+          <w:color w:val="111111"/>
+          <w:rtl w:val="0"/>
+        </w:rPr>
+        <w:t xml:space="preserve">Data analysis using existing datasets</w:t>
+      </w:r>
+    </w:p>
+    <w:p>
+      <w:pPr>
+        <w:keepNext w:val="0"/>
+        <w:widowControl/>
+        <w:numPr>
+          <w:ilvl w:val="0"/>
+          <w:numId w:val="33"/>
+        </w:numPr>
+        <w:spacing w:after="80" w:before="0" w:beforeAutospacing="0" w:lineRule="auto" w:line="252"/>
+        <w:ind w:left="720" w:hanging="360"/>
+      </w:pPr>
+      <w:r>
+        <w:rPr>
+          <w:rFonts w:ascii="Arial" w:hAnsi="Arial" w:eastAsia="Arial" w:cs="Arial"/>
+          <w:color w:val="111111"/>
+          <w:rtl w:val="0"/>
+        </w:rPr>
+        <w:t xml:space="preserve">Prototype development</w:t>
+      </w:r>
+    </w:p>
+    <w:p>
+      <w:pPr>
+        <w:keepNext w:val="0"/>
+        <w:widowControl/>
+        <w:spacing w:after="80" w:before="0" w:lineRule="auto" w:line="252"/>
+        <w:rPr>
+          <w:rFonts w:ascii="Arial" w:hAnsi="Arial" w:eastAsia="Arial" w:cs="Arial"/>
+        </w:rPr>
+      </w:pPr>
+      <w:r>
+        <w:rPr>
+          <w:rFonts w:ascii="Arial" w:hAnsi="Arial" w:eastAsia="Arial" w:cs="Arial"/>
+          <w:color w:val="111111"/>
+          <w:rtl w:val="0"/>
+        </w:rPr>
+        <w:t xml:space="preserve">Activity: Sort the Project Cards</w:t>
+      </w:r>
+    </w:p>
+    <w:p>
+      <w:pPr>
+        <w:keepNext w:val="0"/>
+        <w:widowControl/>
+        <w:spacing w:after="80" w:before="0" w:lineRule="auto" w:line="252"/>
+        <w:rPr>
+          <w:rFonts w:ascii="Arial" w:hAnsi="Arial" w:eastAsia="Arial" w:cs="Arial"/>
+        </w:rPr>
+      </w:pPr>
+      <w:r>
+        <w:rPr>
+          <w:rFonts w:ascii="Arial" w:hAnsi="Arial" w:eastAsia="Arial" w:cs="Arial"/>
+          <w:color w:val="111111"/>
+          <w:rtl w:val="0"/>
+        </w:rPr>
+        <w:t xml:space="preserve">Provide students with brief descriptions of possible student projects. Students sort them into categories:</w:t>
+      </w:r>
+    </w:p>
+    <w:p>
+      <w:pPr>
+        <w:keepNext w:val="0"/>
+        <w:widowControl/>
+        <w:numPr>
+          <w:ilvl w:val="0"/>
+          <w:numId w:val="18"/>
+        </w:numPr>
+        <w:spacing w:after="80" w:afterAutospacing="0" w:before="0" w:lineRule="auto" w:line="252"/>
+        <w:ind w:left="720" w:hanging="360"/>
+      </w:pPr>
+      <w:r>
+        <w:rPr>
+          <w:rFonts w:ascii="Arial" w:hAnsi="Arial" w:eastAsia="Arial" w:cs="Arial"/>
+          <w:color w:val="111111"/>
+          <w:rtl w:val="0"/>
+        </w:rPr>
+        <w:t xml:space="preserve">Not research yet</w:t>
+      </w:r>
+    </w:p>
+    <w:p>
+      <w:pPr>
+        <w:keepNext w:val="0"/>
+        <w:widowControl/>
+        <w:numPr>
+          <w:ilvl w:val="0"/>
+          <w:numId w:val="18"/>
+        </w:numPr>
+        <w:spacing w:after="80" w:afterAutospacing="0" w:before="0" w:beforeAutospacing="0" w:lineRule="auto" w:line="252"/>
+        <w:ind w:left="720" w:hanging="360"/>
+      </w:pPr>
+      <w:r>
+        <w:rPr>
+          <w:rFonts w:ascii="Arial" w:hAnsi="Arial" w:eastAsia="Arial" w:cs="Arial"/>
+          <w:color w:val="111111"/>
+          <w:rtl w:val="0"/>
+        </w:rPr>
+        <w:t xml:space="preserve">Possible research, but needs refinement</w:t>
+      </w:r>
+    </w:p>
+    <w:p>
+      <w:pPr>
+        <w:keepNext w:val="0"/>
+        <w:widowControl/>
+        <w:numPr>
+          <w:ilvl w:val="0"/>
+          <w:numId w:val="18"/>
+        </w:numPr>
+        <w:spacing w:after="80" w:afterAutospacing="0" w:before="0" w:beforeAutospacing="0" w:lineRule="auto" w:line="252"/>
+        <w:ind w:left="720" w:hanging="360"/>
+      </w:pPr>
+      <w:r>
+        <w:rPr>
+          <w:rFonts w:ascii="Arial" w:hAnsi="Arial" w:eastAsia="Arial" w:cs="Arial"/>
+          <w:color w:val="111111"/>
+          <w:rtl w:val="0"/>
+        </w:rPr>
+        <w:t xml:space="preserve">Strong research direction</w:t>
+      </w:r>
+    </w:p>
+    <w:p>
+      <w:pPr>
+        <w:keepNext w:val="0"/>
+        <w:widowControl/>
+        <w:numPr>
+          <w:ilvl w:val="0"/>
+          <w:numId w:val="18"/>
+        </w:numPr>
+        <w:spacing w:after="80" w:afterAutospacing="0" w:before="0" w:beforeAutospacing="0" w:lineRule="auto" w:line="252"/>
+        <w:ind w:left="720" w:hanging="360"/>
+      </w:pPr>
+      <w:r>
+        <w:rPr>
+          <w:rFonts w:ascii="Arial" w:hAnsi="Arial" w:eastAsia="Arial" w:cs="Arial"/>
+          <w:color w:val="111111"/>
+          <w:rtl w:val="0"/>
+        </w:rPr>
+        <w:t xml:space="preserve">Engineering design project</w:t>
+      </w:r>
+    </w:p>
+    <w:p>
+      <w:pPr>
+        <w:keepNext w:val="0"/>
+        <w:widowControl/>
+        <w:numPr>
+          <w:ilvl w:val="0"/>
+          <w:numId w:val="18"/>
+        </w:numPr>
+        <w:spacing w:after="80" w:before="0" w:beforeAutospacing="0" w:lineRule="auto" w:line="252"/>
+        <w:ind w:left="720" w:hanging="360"/>
+      </w:pPr>
+      <w:r>
+        <w:rPr>
+          <w:rFonts w:ascii="Arial" w:hAnsi="Arial" w:eastAsia="Arial" w:cs="Arial"/>
+          <w:color w:val="111111"/>
+          <w:rtl w:val="0"/>
+        </w:rPr>
+        <w:t xml:space="preserve">Ethically or practically problematic</w:t>
+      </w:r>
+    </w:p>
+    <w:p>
+      <w:pPr>
+        <w:keepNext w:val="0"/>
+        <w:widowControl/>
+        <w:spacing w:after="80" w:before="0" w:lineRule="auto" w:line="252"/>
+        <w:rPr>
+          <w:rFonts w:ascii="Arial" w:hAnsi="Arial" w:eastAsia="Arial" w:cs="Arial"/>
+        </w:rPr>
+      </w:pPr>
+      <w:r>
+        <w:rPr>
+          <w:rFonts w:ascii="Arial" w:hAnsi="Arial" w:eastAsia="Arial" w:cs="Arial"/>
+          <w:color w:val="111111"/>
+          <w:rtl w:val="0"/>
+        </w:rPr>
+        <w:t xml:space="preserve">After sorting, students explain what made each project strong, weak, feasible, or problematic.</w:t>
+      </w:r>
+    </w:p>
+    <w:p>
+      <w:pPr>
+        <w:pStyle w:val="Heading3"/>
+        <w:keepNext/>
+        <w:keepLines w:val="0"/>
+        <w:widowControl/>
+        <w:spacing w:before="140" w:lineRule="auto" w:after="40" w:line="240"/>
+        <w:rPr>
+          <w:rFonts w:ascii="Arial" w:hAnsi="Arial" w:eastAsia="Arial" w:cs="Arial"/>
+          <w:b w:val="1"/>
+          <w:bCs w:val="1"/>
+          <w:sz w:val="26"/>
+          <w:szCs w:val="26"/>
+        </w:rPr>
+      </w:pPr>
+      <w:bookmarkStart w:colFirst="0" w:colLast="0" w:name="_nq7sbpwceofa" w:id="19"/>
+      <w:bookmarkEnd w:id="19"/>
+      <w:r>
+        <w:rPr>
+          <w:rFonts w:ascii="Arial" w:hAnsi="Arial" w:eastAsia="Arial" w:cs="Arial"/>
+          <w:b/>
+          <w:bCs w:val="1"/>
+          <w:color w:val="111111"/>
+          <w:sz w:val="26"/>
+          <w:szCs w:val="26"/>
+          <w:rtl w:val="0"/>
+        </w:rPr>
+        <w:t xml:space="preserve">Day 3: Science Identity and Skills Inventory</w:t>
+      </w:r>
+    </w:p>
+    <w:p>
+      <w:pPr>
+        <w:keepNext w:val="0"/>
+        <w:widowControl/>
+        <w:spacing w:after="80" w:before="0" w:lineRule="auto" w:line="252"/>
+        <w:rPr>
+          <w:rFonts w:ascii="Arial" w:hAnsi="Arial" w:eastAsia="Arial" w:cs="Arial"/>
+        </w:rPr>
+      </w:pPr>
+      <w:r>
+        <w:rPr>
+          <w:rFonts w:ascii="Arial" w:hAnsi="Arial" w:eastAsia="Arial" w:cs="Arial"/>
+          <w:color w:val="111111"/>
+          <w:rtl w:val="0"/>
+        </w:rPr>
+        <w:t xml:space="preserve">Students complete Student Handout 2: Science Identity and Skills Inventory.</w:t>
+      </w:r>
+    </w:p>
+    <w:p>
+      <w:pPr>
+        <w:keepNext w:val="0"/>
+        <w:widowControl/>
+        <w:spacing w:after="80" w:before="0" w:lineRule="auto" w:line="252"/>
+        <w:rPr>
+          <w:rFonts w:ascii="Arial" w:hAnsi="Arial" w:eastAsia="Arial" w:cs="Arial"/>
+        </w:rPr>
+      </w:pPr>
+      <w:r>
+        <w:rPr>
+          <w:rFonts w:ascii="Arial" w:hAnsi="Arial" w:eastAsia="Arial" w:cs="Arial"/>
+          <w:color w:val="111111"/>
+          <w:rtl w:val="0"/>
+        </w:rPr>
+        <w:t xml:space="preserve">This activity helps students identify strengths that may not always appear in traditional science classes, such as building, coding, drawing, organizing, communicating, troubleshooting, observing, or working patiently through repeated failure.</w:t>
+      </w:r>
+    </w:p>
+    <w:p>
+      <w:pPr>
+        <w:keepNext w:val="0"/>
+        <w:widowControl/>
+        <w:spacing w:after="80" w:before="0" w:lineRule="auto" w:line="252"/>
+        <w:rPr>
+          <w:rFonts w:ascii="Arial" w:hAnsi="Arial" w:eastAsia="Arial" w:cs="Arial"/>
+        </w:rPr>
+      </w:pPr>
+      <w:r>
+        <w:rPr>
+          <w:rFonts w:ascii="Arial" w:hAnsi="Arial" w:eastAsia="Arial" w:cs="Arial"/>
+          <w:color w:val="111111"/>
+          <w:rtl w:val="0"/>
+        </w:rPr>
+        <w:t xml:space="preserve">Teacher should emphasize that STARLAB needs many kinds of thinkers:</w:t>
+      </w:r>
+    </w:p>
+    <w:p>
+      <w:pPr>
+        <w:keepNext w:val="0"/>
+        <w:widowControl/>
+        <w:numPr>
+          <w:ilvl w:val="0"/>
+          <w:numId w:val="49"/>
+        </w:numPr>
+        <w:spacing w:after="80" w:afterAutospacing="0" w:before="0" w:lineRule="auto" w:line="252"/>
+        <w:ind w:left="720" w:hanging="360"/>
+      </w:pPr>
+      <w:r>
+        <w:rPr>
+          <w:rFonts w:ascii="Arial" w:hAnsi="Arial" w:eastAsia="Arial" w:cs="Arial"/>
+          <w:color w:val="111111"/>
+          <w:rtl w:val="0"/>
+        </w:rPr>
+        <w:t xml:space="preserve">The careful measurer</w:t>
+      </w:r>
+    </w:p>
+    <w:p>
+      <w:pPr>
+        <w:keepNext w:val="0"/>
+        <w:widowControl/>
+        <w:numPr>
+          <w:ilvl w:val="0"/>
+          <w:numId w:val="49"/>
+        </w:numPr>
+        <w:spacing w:after="80" w:afterAutospacing="0" w:before="0" w:beforeAutospacing="0" w:lineRule="auto" w:line="252"/>
+        <w:ind w:left="720" w:hanging="360"/>
+      </w:pPr>
+      <w:r>
+        <w:rPr>
+          <w:rFonts w:ascii="Arial" w:hAnsi="Arial" w:eastAsia="Arial" w:cs="Arial"/>
+          <w:color w:val="111111"/>
+          <w:rtl w:val="0"/>
+        </w:rPr>
+        <w:t xml:space="preserve">The builder</w:t>
+      </w:r>
+    </w:p>
+    <w:p>
+      <w:pPr>
+        <w:keepNext w:val="0"/>
+        <w:widowControl/>
+        <w:numPr>
+          <w:ilvl w:val="0"/>
+          <w:numId w:val="49"/>
+        </w:numPr>
+        <w:spacing w:after="80" w:afterAutospacing="0" w:before="0" w:beforeAutospacing="0" w:lineRule="auto" w:line="252"/>
+        <w:ind w:left="720" w:hanging="360"/>
+      </w:pPr>
+      <w:r>
+        <w:rPr>
+          <w:rFonts w:ascii="Arial" w:hAnsi="Arial" w:eastAsia="Arial" w:cs="Arial"/>
+          <w:color w:val="111111"/>
+          <w:rtl w:val="0"/>
+        </w:rPr>
+        <w:t xml:space="preserve">The coder</w:t>
+      </w:r>
+    </w:p>
+    <w:p>
+      <w:pPr>
+        <w:keepNext w:val="0"/>
+        <w:widowControl/>
+        <w:numPr>
+          <w:ilvl w:val="0"/>
+          <w:numId w:val="49"/>
+        </w:numPr>
+        <w:spacing w:after="80" w:afterAutospacing="0" w:before="0" w:beforeAutospacing="0" w:lineRule="auto" w:line="252"/>
+        <w:ind w:left="720" w:hanging="360"/>
+      </w:pPr>
+      <w:r>
+        <w:rPr>
+          <w:rFonts w:ascii="Arial" w:hAnsi="Arial" w:eastAsia="Arial" w:cs="Arial"/>
+          <w:color w:val="111111"/>
+          <w:rtl w:val="0"/>
+        </w:rPr>
+        <w:t xml:space="preserve">The artist/designer</w:t>
+      </w:r>
+    </w:p>
+    <w:p>
+      <w:pPr>
+        <w:keepNext w:val="0"/>
+        <w:widowControl/>
+        <w:numPr>
+          <w:ilvl w:val="0"/>
+          <w:numId w:val="49"/>
+        </w:numPr>
+        <w:spacing w:after="80" w:afterAutospacing="0" w:before="0" w:beforeAutospacing="0" w:lineRule="auto" w:line="252"/>
+        <w:ind w:left="720" w:hanging="360"/>
+      </w:pPr>
+      <w:r>
+        <w:rPr>
+          <w:rFonts w:ascii="Arial" w:hAnsi="Arial" w:eastAsia="Arial" w:cs="Arial"/>
+          <w:color w:val="111111"/>
+          <w:rtl w:val="0"/>
+        </w:rPr>
+        <w:t xml:space="preserve">The organizer</w:t>
+      </w:r>
+    </w:p>
+    <w:p>
+      <w:pPr>
+        <w:keepNext w:val="0"/>
+        <w:widowControl/>
+        <w:numPr>
+          <w:ilvl w:val="0"/>
+          <w:numId w:val="49"/>
+        </w:numPr>
+        <w:spacing w:after="80" w:afterAutospacing="0" w:before="0" w:beforeAutospacing="0" w:lineRule="auto" w:line="252"/>
+        <w:ind w:left="720" w:hanging="360"/>
+      </w:pPr>
+      <w:r>
+        <w:rPr>
+          <w:rFonts w:ascii="Arial" w:hAnsi="Arial" w:eastAsia="Arial" w:cs="Arial"/>
+          <w:color w:val="111111"/>
+          <w:rtl w:val="0"/>
+        </w:rPr>
+        <w:t xml:space="preserve">The question asker</w:t>
+      </w:r>
+    </w:p>
+    <w:p>
+      <w:pPr>
+        <w:keepNext w:val="0"/>
+        <w:widowControl/>
+        <w:numPr>
+          <w:ilvl w:val="0"/>
+          <w:numId w:val="49"/>
+        </w:numPr>
+        <w:spacing w:after="80" w:afterAutospacing="0" w:before="0" w:beforeAutospacing="0" w:lineRule="auto" w:line="252"/>
+        <w:ind w:left="720" w:hanging="360"/>
+      </w:pPr>
+      <w:r>
+        <w:rPr>
+          <w:rFonts w:ascii="Arial" w:hAnsi="Arial" w:eastAsia="Arial" w:cs="Arial"/>
+          <w:color w:val="111111"/>
+          <w:rtl w:val="0"/>
+        </w:rPr>
+        <w:t xml:space="preserve">The troubleshooter</w:t>
+      </w:r>
+    </w:p>
+    <w:p>
+      <w:pPr>
+        <w:keepNext w:val="0"/>
+        <w:widowControl/>
+        <w:numPr>
+          <w:ilvl w:val="0"/>
+          <w:numId w:val="49"/>
+        </w:numPr>
+        <w:spacing w:after="80" w:afterAutospacing="0" w:before="0" w:beforeAutospacing="0" w:lineRule="auto" w:line="252"/>
+        <w:ind w:left="720" w:hanging="360"/>
+      </w:pPr>
+      <w:r>
+        <w:rPr>
+          <w:rFonts w:ascii="Arial" w:hAnsi="Arial" w:eastAsia="Arial" w:cs="Arial"/>
+          <w:color w:val="111111"/>
+          <w:rtl w:val="0"/>
+        </w:rPr>
+        <w:t xml:space="preserve">The communicator</w:t>
+      </w:r>
+    </w:p>
+    <w:p>
+      <w:pPr>
+        <w:keepNext w:val="0"/>
+        <w:widowControl/>
+        <w:numPr>
+          <w:ilvl w:val="0"/>
+          <w:numId w:val="49"/>
+        </w:numPr>
+        <w:spacing w:after="80" w:before="0" w:beforeAutospacing="0" w:lineRule="auto" w:line="252"/>
+        <w:ind w:left="720" w:hanging="360"/>
+      </w:pPr>
+      <w:r>
+        <w:rPr>
+          <w:rFonts w:ascii="Arial" w:hAnsi="Arial" w:eastAsia="Arial" w:cs="Arial"/>
+          <w:color w:val="111111"/>
+          <w:rtl w:val="0"/>
+        </w:rPr>
+        <w:t xml:space="preserve">The patient observer</w:t>
+      </w:r>
+    </w:p>
+    <w:p>
+      <w:pPr>
+        <w:keepNext w:val="0"/>
+        <w:widowControl/>
+        <w:spacing w:after="80" w:before="0" w:lineRule="auto" w:line="252"/>
+        <w:rPr>
+          <w:rFonts w:ascii="Arial" w:hAnsi="Arial" w:eastAsia="Arial" w:cs="Arial"/>
+        </w:rPr>
+      </w:pPr>
+      <w:r>
+        <w:rPr>
+          <w:rFonts w:ascii="Arial" w:hAnsi="Arial" w:eastAsia="Arial" w:cs="Arial"/>
+          <w:color w:val="111111"/>
+          <w:rtl w:val="0"/>
+        </w:rPr>
+        <w:t xml:space="preserve">Small-group discussion:</w:t>
+      </w:r>
+    </w:p>
+    <w:p>
+      <w:pPr>
+        <w:keepNext w:val="0"/>
+        <w:widowControl/>
+        <w:spacing w:after="80" w:before="0" w:lineRule="auto" w:line="252"/>
+        <w:rPr>
+          <w:rFonts w:ascii="Arial" w:hAnsi="Arial" w:eastAsia="Arial" w:cs="Arial"/>
+        </w:rPr>
+      </w:pPr>
+      <w:r>
+        <w:rPr>
+          <w:rFonts w:ascii="Arial" w:hAnsi="Arial" w:eastAsia="Arial" w:cs="Arial"/>
+          <w:color w:val="111111"/>
+          <w:rtl w:val="0"/>
+        </w:rPr>
+        <w:t xml:space="preserve">Students share one skill they bring to research and one skill they want to develop.</w:t>
+      </w:r>
+    </w:p>
+    <w:p>
+      <w:pPr>
+        <w:keepNext w:val="0"/>
+        <w:widowControl/>
+        <w:spacing w:after="80" w:before="0" w:lineRule="auto" w:line="252"/>
+        <w:rPr>
+          <w:rFonts w:ascii="Arial" w:hAnsi="Arial" w:eastAsia="Arial" w:cs="Arial"/>
+        </w:rPr>
+      </w:pPr>
+      <w:r>
+        <w:rPr>
+          <w:rFonts w:ascii="Arial" w:hAnsi="Arial" w:eastAsia="Arial" w:cs="Arial"/>
+          <w:color w:val="111111"/>
+          <w:rtl w:val="0"/>
+        </w:rPr>
+        <w:t xml:space="preserve">Optional extension:</w:t>
+      </w:r>
+    </w:p>
+    <w:p>
+      <w:pPr>
+        <w:keepNext w:val="0"/>
+        <w:widowControl/>
+        <w:spacing w:after="80" w:before="0" w:lineRule="auto" w:line="252"/>
+        <w:rPr>
+          <w:rFonts w:ascii="Arial" w:hAnsi="Arial" w:eastAsia="Arial" w:cs="Arial"/>
+        </w:rPr>
+      </w:pPr>
+      <w:r>
+        <w:rPr>
+          <w:rFonts w:ascii="Arial" w:hAnsi="Arial" w:eastAsia="Arial" w:cs="Arial"/>
+          <w:color w:val="111111"/>
+          <w:rtl w:val="0"/>
+        </w:rPr>
+        <w:t xml:space="preserve">Students create a short “researcher profile” card to help the teacher identify possible mentor matches or project groupings.</w:t>
+      </w:r>
+    </w:p>
+    <w:p>
+      <w:pPr>
+        <w:pStyle w:val="Heading3"/>
+        <w:keepNext/>
+        <w:keepLines w:val="0"/>
+        <w:widowControl/>
+        <w:spacing w:before="140" w:lineRule="auto" w:after="40" w:line="240"/>
+        <w:rPr>
+          <w:rFonts w:ascii="Arial" w:hAnsi="Arial" w:eastAsia="Arial" w:cs="Arial"/>
+          <w:b w:val="1"/>
+          <w:bCs w:val="1"/>
+          <w:sz w:val="26"/>
+          <w:szCs w:val="26"/>
+        </w:rPr>
+      </w:pPr>
+      <w:bookmarkStart w:colFirst="0" w:colLast="0" w:name="_tu7rsyf0u77q" w:id="20"/>
+      <w:bookmarkEnd w:id="20"/>
+      <w:r>
+        <w:rPr>
+          <w:rFonts w:ascii="Arial" w:hAnsi="Arial" w:eastAsia="Arial" w:cs="Arial"/>
+          <w:b/>
+          <w:bCs w:val="1"/>
+          <w:color w:val="111111"/>
+          <w:sz w:val="26"/>
+          <w:szCs w:val="26"/>
+          <w:rtl w:val="0"/>
+        </w:rPr>
+        <w:t xml:space="preserve">Day 4: Research Ethics and Integrity</w:t>
+      </w:r>
+    </w:p>
+    <w:p>
+      <w:pPr>
+        <w:keepNext w:val="0"/>
+        <w:widowControl/>
+        <w:spacing w:after="80" w:before="0" w:lineRule="auto" w:line="252"/>
+        <w:rPr>
+          <w:rFonts w:ascii="Arial" w:hAnsi="Arial" w:eastAsia="Arial" w:cs="Arial"/>
+        </w:rPr>
+      </w:pPr>
+      <w:r>
+        <w:rPr>
+          <w:rFonts w:ascii="Arial" w:hAnsi="Arial" w:eastAsia="Arial" w:cs="Arial"/>
+          <w:color w:val="111111"/>
+          <w:rtl w:val="0"/>
+        </w:rPr>
+        <w:t xml:space="preserve">Introduce the idea that student researchers have ethical responsibilities. This discussion should be age-appropriate but serious. Students should understand that curiosity does not override safety, honesty, consent, animal welfare, human subject protection, environmental responsibility, or proper credit to sources.</w:t>
+      </w:r>
+    </w:p>
+    <w:p>
+      <w:pPr>
+        <w:keepNext w:val="0"/>
+        <w:widowControl/>
+        <w:spacing w:after="80" w:before="0" w:lineRule="auto" w:line="252"/>
+        <w:rPr>
+          <w:rFonts w:ascii="Arial" w:hAnsi="Arial" w:eastAsia="Arial" w:cs="Arial"/>
+        </w:rPr>
+      </w:pPr>
+      <w:r>
+        <w:rPr>
+          <w:rFonts w:ascii="Arial" w:hAnsi="Arial" w:eastAsia="Arial" w:cs="Arial"/>
+          <w:color w:val="111111"/>
+          <w:rtl w:val="0"/>
+        </w:rPr>
+        <w:t xml:space="preserve">Topics to introduce:</w:t>
+      </w:r>
+    </w:p>
+    <w:p>
+      <w:pPr>
+        <w:keepNext w:val="0"/>
+        <w:widowControl/>
+        <w:numPr>
+          <w:ilvl w:val="0"/>
+          <w:numId w:val="32"/>
+        </w:numPr>
+        <w:spacing w:after="80" w:afterAutospacing="0" w:before="0" w:lineRule="auto" w:line="252"/>
+        <w:ind w:left="720" w:hanging="360"/>
+      </w:pPr>
+      <w:r>
+        <w:rPr>
+          <w:rFonts w:ascii="Arial" w:hAnsi="Arial" w:eastAsia="Arial" w:cs="Arial"/>
+          <w:color w:val="111111"/>
+          <w:rtl w:val="0"/>
+        </w:rPr>
+        <w:t xml:space="preserve">Honest data collection and reporting</w:t>
+      </w:r>
+    </w:p>
+    <w:p>
+      <w:pPr>
+        <w:keepNext w:val="0"/>
+        <w:widowControl/>
+        <w:numPr>
+          <w:ilvl w:val="0"/>
+          <w:numId w:val="32"/>
+        </w:numPr>
+        <w:spacing w:after="80" w:afterAutospacing="0" w:before="0" w:beforeAutospacing="0" w:lineRule="auto" w:line="252"/>
+        <w:ind w:left="720" w:hanging="360"/>
+      </w:pPr>
+      <w:r>
+        <w:rPr>
+          <w:rFonts w:ascii="Arial" w:hAnsi="Arial" w:eastAsia="Arial" w:cs="Arial"/>
+          <w:color w:val="111111"/>
+          <w:rtl w:val="0"/>
+        </w:rPr>
+        <w:t xml:space="preserve">Not fabricating or deleting inconvenient data</w:t>
+      </w:r>
+    </w:p>
+    <w:p>
+      <w:pPr>
+        <w:keepNext w:val="0"/>
+        <w:widowControl/>
+        <w:numPr>
+          <w:ilvl w:val="0"/>
+          <w:numId w:val="32"/>
+        </w:numPr>
+        <w:spacing w:after="80" w:afterAutospacing="0" w:before="0" w:beforeAutospacing="0" w:lineRule="auto" w:line="252"/>
+        <w:ind w:left="720" w:hanging="360"/>
+      </w:pPr>
+      <w:r>
+        <w:rPr>
+          <w:rFonts w:ascii="Arial" w:hAnsi="Arial" w:eastAsia="Arial" w:cs="Arial"/>
+          <w:color w:val="111111"/>
+          <w:rtl w:val="0"/>
+        </w:rPr>
+        <w:t xml:space="preserve">Proper credit for ideas, images, sources, and mentor contributions</w:t>
+      </w:r>
+    </w:p>
+    <w:p>
+      <w:pPr>
+        <w:keepNext w:val="0"/>
+        <w:widowControl/>
+        <w:numPr>
+          <w:ilvl w:val="0"/>
+          <w:numId w:val="32"/>
+        </w:numPr>
+        <w:spacing w:after="80" w:afterAutospacing="0" w:before="0" w:beforeAutospacing="0" w:lineRule="auto" w:line="252"/>
+        <w:ind w:left="720" w:hanging="360"/>
+      </w:pPr>
+      <w:r>
+        <w:rPr>
+          <w:rFonts w:ascii="Arial" w:hAnsi="Arial" w:eastAsia="Arial" w:cs="Arial"/>
+          <w:color w:val="111111"/>
+          <w:rtl w:val="0"/>
+        </w:rPr>
+        <w:t xml:space="preserve">Safety procedures and teacher approval</w:t>
+      </w:r>
+    </w:p>
+    <w:p>
+      <w:pPr>
+        <w:keepNext w:val="0"/>
+        <w:widowControl/>
+        <w:numPr>
+          <w:ilvl w:val="0"/>
+          <w:numId w:val="32"/>
+        </w:numPr>
+        <w:spacing w:after="80" w:afterAutospacing="0" w:before="0" w:beforeAutospacing="0" w:lineRule="auto" w:line="252"/>
+        <w:ind w:left="720" w:hanging="360"/>
+      </w:pPr>
+      <w:r>
+        <w:rPr>
+          <w:rFonts w:ascii="Arial" w:hAnsi="Arial" w:eastAsia="Arial" w:cs="Arial"/>
+          <w:color w:val="111111"/>
+          <w:rtl w:val="0"/>
+        </w:rPr>
+        <w:t xml:space="preserve">Human subjects research and informed consent</w:t>
+      </w:r>
+    </w:p>
+    <w:p>
+      <w:pPr>
+        <w:keepNext w:val="0"/>
+        <w:widowControl/>
+        <w:numPr>
+          <w:ilvl w:val="0"/>
+          <w:numId w:val="32"/>
+        </w:numPr>
+        <w:spacing w:after="80" w:afterAutospacing="0" w:before="0" w:beforeAutospacing="0" w:lineRule="auto" w:line="252"/>
+        <w:ind w:left="720" w:hanging="360"/>
+      </w:pPr>
+      <w:r>
+        <w:rPr>
+          <w:rFonts w:ascii="Arial" w:hAnsi="Arial" w:eastAsia="Arial" w:cs="Arial"/>
+          <w:color w:val="111111"/>
+          <w:rtl w:val="0"/>
+        </w:rPr>
+        <w:t xml:space="preserve">Animal research restrictions</w:t>
+      </w:r>
+    </w:p>
+    <w:p>
+      <w:pPr>
+        <w:keepNext w:val="0"/>
+        <w:widowControl/>
+        <w:numPr>
+          <w:ilvl w:val="0"/>
+          <w:numId w:val="32"/>
+        </w:numPr>
+        <w:spacing w:after="80" w:afterAutospacing="0" w:before="0" w:beforeAutospacing="0" w:lineRule="auto" w:line="252"/>
+        <w:ind w:left="720" w:hanging="360"/>
+      </w:pPr>
+      <w:r>
+        <w:rPr>
+          <w:rFonts w:ascii="Arial" w:hAnsi="Arial" w:eastAsia="Arial" w:cs="Arial"/>
+          <w:color w:val="111111"/>
+          <w:rtl w:val="0"/>
+        </w:rPr>
+        <w:t xml:space="preserve">Environmental responsibility</w:t>
+      </w:r>
+    </w:p>
+    <w:p>
+      <w:pPr>
+        <w:keepNext w:val="0"/>
+        <w:widowControl/>
+        <w:numPr>
+          <w:ilvl w:val="0"/>
+          <w:numId w:val="32"/>
+        </w:numPr>
+        <w:spacing w:after="80" w:afterAutospacing="0" w:before="0" w:beforeAutospacing="0" w:lineRule="auto" w:line="252"/>
+        <w:ind w:left="720" w:hanging="360"/>
+      </w:pPr>
+      <w:r>
+        <w:rPr>
+          <w:rFonts w:ascii="Arial" w:hAnsi="Arial" w:eastAsia="Arial" w:cs="Arial"/>
+          <w:color w:val="111111"/>
+          <w:rtl w:val="0"/>
+        </w:rPr>
+        <w:t xml:space="preserve">Use of school, university, or community equipment</w:t>
+      </w:r>
+    </w:p>
+    <w:p>
+      <w:pPr>
+        <w:keepNext w:val="0"/>
+        <w:widowControl/>
+        <w:numPr>
+          <w:ilvl w:val="0"/>
+          <w:numId w:val="32"/>
+        </w:numPr>
+        <w:spacing w:after="80" w:before="0" w:beforeAutospacing="0" w:lineRule="auto" w:line="252"/>
+        <w:ind w:left="720" w:hanging="360"/>
+      </w:pPr>
+      <w:r>
+        <w:rPr>
+          <w:rFonts w:ascii="Arial" w:hAnsi="Arial" w:eastAsia="Arial" w:cs="Arial"/>
+          <w:color w:val="111111"/>
+          <w:rtl w:val="0"/>
+        </w:rPr>
+        <w:t xml:space="preserve">Respectful collaboration with mentors and peers</w:t>
+      </w:r>
+    </w:p>
+    <w:p>
+      <w:pPr>
+        <w:keepNext w:val="0"/>
+        <w:widowControl/>
+        <w:spacing w:after="80" w:before="0" w:lineRule="auto" w:line="252"/>
+        <w:rPr>
+          <w:rFonts w:ascii="Arial" w:hAnsi="Arial" w:eastAsia="Arial" w:cs="Arial"/>
+        </w:rPr>
+      </w:pPr>
+      <w:r>
+        <w:rPr>
+          <w:rFonts w:ascii="Arial" w:hAnsi="Arial" w:eastAsia="Arial" w:cs="Arial"/>
+          <w:color w:val="111111"/>
+          <w:rtl w:val="0"/>
+        </w:rPr>
+        <w:t xml:space="preserve">Students complete Student Handout 4: Research Ethics and Integrity Agreement.</w:t>
+      </w:r>
+    </w:p>
+    <w:p>
+      <w:pPr>
+        <w:keepNext w:val="0"/>
+        <w:widowControl/>
+        <w:spacing w:after="80" w:before="0" w:lineRule="auto" w:line="252"/>
+        <w:rPr>
+          <w:rFonts w:ascii="Arial" w:hAnsi="Arial" w:eastAsia="Arial" w:cs="Arial"/>
+        </w:rPr>
+      </w:pPr>
+      <w:r>
+        <w:rPr>
+          <w:rFonts w:ascii="Arial" w:hAnsi="Arial" w:eastAsia="Arial" w:cs="Arial"/>
+          <w:color w:val="111111"/>
+          <w:rtl w:val="0"/>
+        </w:rPr>
+        <w:t xml:space="preserve">Teacher note:</w:t>
+      </w:r>
+    </w:p>
+    <w:p>
+      <w:pPr>
+        <w:keepNext w:val="0"/>
+        <w:widowControl/>
+        <w:spacing w:after="80" w:before="0" w:lineRule="auto" w:line="252"/>
+        <w:rPr>
+          <w:rFonts w:ascii="Arial" w:hAnsi="Arial" w:eastAsia="Arial" w:cs="Arial"/>
+        </w:rPr>
+      </w:pPr>
+      <w:r>
+        <w:rPr>
+          <w:rFonts w:ascii="Arial" w:hAnsi="Arial" w:eastAsia="Arial" w:cs="Arial"/>
+          <w:color w:val="111111"/>
+          <w:rtl w:val="0"/>
+        </w:rPr>
+        <w:t xml:space="preserve">This is not the full safety approval process. That comes later. This is an introductory ethics foundation.</w:t>
+      </w:r>
+    </w:p>
+    <w:p>
+      <w:pPr>
+        <w:pStyle w:val="Heading3"/>
+        <w:keepNext/>
+        <w:keepLines w:val="0"/>
+        <w:widowControl/>
+        <w:spacing w:before="140" w:lineRule="auto" w:after="40" w:line="240"/>
+        <w:rPr>
+          <w:rFonts w:ascii="Arial" w:hAnsi="Arial" w:eastAsia="Arial" w:cs="Arial"/>
+          <w:b w:val="1"/>
+          <w:bCs w:val="1"/>
+          <w:sz w:val="26"/>
+          <w:szCs w:val="26"/>
+        </w:rPr>
+      </w:pPr>
+      <w:bookmarkStart w:colFirst="0" w:colLast="0" w:name="_eso19tbunva6" w:id="21"/>
+      <w:bookmarkEnd w:id="21"/>
+      <w:r>
+        <w:rPr>
+          <w:rFonts w:ascii="Arial" w:hAnsi="Arial" w:eastAsia="Arial" w:cs="Arial"/>
+          <w:b/>
+          <w:bCs w:val="1"/>
+          <w:color w:val="111111"/>
+          <w:sz w:val="26"/>
+          <w:szCs w:val="26"/>
+          <w:rtl w:val="0"/>
+        </w:rPr>
+        <w:t xml:space="preserve">Day 5: Research Interest Exploration</w:t>
+      </w:r>
+    </w:p>
+    <w:p>
+      <w:pPr>
+        <w:keepNext w:val="0"/>
+        <w:widowControl/>
+        <w:spacing w:after="80" w:before="0" w:lineRule="auto" w:line="252"/>
+        <w:rPr>
+          <w:rFonts w:ascii="Arial" w:hAnsi="Arial" w:eastAsia="Arial" w:cs="Arial"/>
+        </w:rPr>
+      </w:pPr>
+      <w:r>
+        <w:rPr>
+          <w:rFonts w:ascii="Arial" w:hAnsi="Arial" w:eastAsia="Arial" w:cs="Arial"/>
+          <w:color w:val="111111"/>
+          <w:rtl w:val="0"/>
+        </w:rPr>
+        <w:t xml:space="preserve">Students complete Student Handout 3: Research Interest Inventory.</w:t>
+      </w:r>
+    </w:p>
+    <w:p>
+      <w:pPr>
+        <w:keepNext w:val="0"/>
+        <w:widowControl/>
+        <w:spacing w:after="80" w:before="0" w:lineRule="auto" w:line="252"/>
+        <w:rPr>
+          <w:rFonts w:ascii="Arial" w:hAnsi="Arial" w:eastAsia="Arial" w:cs="Arial"/>
+        </w:rPr>
+      </w:pPr>
+      <w:r>
+        <w:rPr>
+          <w:rFonts w:ascii="Arial" w:hAnsi="Arial" w:eastAsia="Arial" w:cs="Arial"/>
+          <w:color w:val="111111"/>
+          <w:rtl w:val="0"/>
+        </w:rPr>
+        <w:t xml:space="preserve">Students should generate broad interest areas first, not final project questions. Encourage them to think across disciplines.</w:t>
+      </w:r>
+    </w:p>
+    <w:p>
+      <w:pPr>
+        <w:keepNext w:val="0"/>
+        <w:widowControl/>
+        <w:spacing w:after="80" w:before="0" w:lineRule="auto" w:line="252"/>
+        <w:rPr>
+          <w:rFonts w:ascii="Arial" w:hAnsi="Arial" w:eastAsia="Arial" w:cs="Arial"/>
+        </w:rPr>
+      </w:pPr>
+      <w:r>
+        <w:rPr>
+          <w:rFonts w:ascii="Arial" w:hAnsi="Arial" w:eastAsia="Arial" w:cs="Arial"/>
+          <w:color w:val="111111"/>
+          <w:rtl w:val="0"/>
+        </w:rPr>
+        <w:t xml:space="preserve">Possible prompts:</w:t>
+      </w:r>
+    </w:p>
+    <w:p>
+      <w:pPr>
+        <w:keepNext w:val="0"/>
+        <w:widowControl/>
+        <w:numPr>
+          <w:ilvl w:val="0"/>
+          <w:numId w:val="72"/>
+        </w:numPr>
+        <w:spacing w:after="80" w:afterAutospacing="0" w:before="0" w:lineRule="auto" w:line="252"/>
+        <w:ind w:left="720" w:hanging="360"/>
+      </w:pPr>
+      <w:r>
+        <w:rPr>
+          <w:rFonts w:ascii="Arial" w:hAnsi="Arial" w:eastAsia="Arial" w:cs="Arial"/>
+          <w:color w:val="111111"/>
+          <w:rtl w:val="0"/>
+        </w:rPr>
+        <w:t xml:space="preserve">What problems do you notice in your community?</w:t>
+      </w:r>
+    </w:p>
+    <w:p>
+      <w:pPr>
+        <w:keepNext w:val="0"/>
+        <w:widowControl/>
+        <w:numPr>
+          <w:ilvl w:val="0"/>
+          <w:numId w:val="72"/>
+        </w:numPr>
+        <w:spacing w:after="80" w:afterAutospacing="0" w:before="0" w:beforeAutospacing="0" w:lineRule="auto" w:line="252"/>
+        <w:ind w:left="720" w:hanging="360"/>
+      </w:pPr>
+      <w:r>
+        <w:rPr>
+          <w:rFonts w:ascii="Arial" w:hAnsi="Arial" w:eastAsia="Arial" w:cs="Arial"/>
+          <w:color w:val="111111"/>
+          <w:rtl w:val="0"/>
+        </w:rPr>
+        <w:t xml:space="preserve">What scientific topics do you find yourself reading or watching videos about?</w:t>
+      </w:r>
+    </w:p>
+    <w:p>
+      <w:pPr>
+        <w:keepNext w:val="0"/>
+        <w:widowControl/>
+        <w:numPr>
+          <w:ilvl w:val="0"/>
+          <w:numId w:val="72"/>
+        </w:numPr>
+        <w:spacing w:after="80" w:afterAutospacing="0" w:before="0" w:beforeAutospacing="0" w:lineRule="auto" w:line="252"/>
+        <w:ind w:left="720" w:hanging="360"/>
+      </w:pPr>
+      <w:r>
+        <w:rPr>
+          <w:rFonts w:ascii="Arial" w:hAnsi="Arial" w:eastAsia="Arial" w:cs="Arial"/>
+          <w:color w:val="111111"/>
+          <w:rtl w:val="0"/>
+        </w:rPr>
+        <w:t xml:space="preserve">What technologies do you wish existed?</w:t>
+      </w:r>
+    </w:p>
+    <w:p>
+      <w:pPr>
+        <w:keepNext w:val="0"/>
+        <w:widowControl/>
+        <w:numPr>
+          <w:ilvl w:val="0"/>
+          <w:numId w:val="72"/>
+        </w:numPr>
+        <w:spacing w:after="80" w:afterAutospacing="0" w:before="0" w:beforeAutospacing="0" w:lineRule="auto" w:line="252"/>
+        <w:ind w:left="720" w:hanging="360"/>
+      </w:pPr>
+      <w:r>
+        <w:rPr>
+          <w:rFonts w:ascii="Arial" w:hAnsi="Arial" w:eastAsia="Arial" w:cs="Arial"/>
+          <w:color w:val="111111"/>
+          <w:rtl w:val="0"/>
+        </w:rPr>
+        <w:t xml:space="preserve">What natural phenomena confuse or fascinate you?</w:t>
+      </w:r>
+    </w:p>
+    <w:p>
+      <w:pPr>
+        <w:keepNext w:val="0"/>
+        <w:widowControl/>
+        <w:numPr>
+          <w:ilvl w:val="0"/>
+          <w:numId w:val="72"/>
+        </w:numPr>
+        <w:spacing w:after="80" w:afterAutospacing="0" w:before="0" w:beforeAutospacing="0" w:lineRule="auto" w:line="252"/>
+        <w:ind w:left="720" w:hanging="360"/>
+      </w:pPr>
+      <w:r>
+        <w:rPr>
+          <w:rFonts w:ascii="Arial" w:hAnsi="Arial" w:eastAsia="Arial" w:cs="Arial"/>
+          <w:color w:val="111111"/>
+          <w:rtl w:val="0"/>
+        </w:rPr>
+        <w:t xml:space="preserve">What would you like to build, test, improve, or understand?</w:t>
+      </w:r>
+    </w:p>
+    <w:p>
+      <w:pPr>
+        <w:keepNext w:val="0"/>
+        <w:widowControl/>
+        <w:numPr>
+          <w:ilvl w:val="0"/>
+          <w:numId w:val="72"/>
+        </w:numPr>
+        <w:spacing w:after="80" w:before="0" w:beforeAutospacing="0" w:lineRule="auto" w:line="252"/>
+        <w:ind w:left="720" w:hanging="360"/>
+      </w:pPr>
+      <w:r>
+        <w:rPr>
+          <w:rFonts w:ascii="Arial" w:hAnsi="Arial" w:eastAsia="Arial" w:cs="Arial"/>
+          <w:color w:val="111111"/>
+          <w:rtl w:val="0"/>
+        </w:rPr>
+        <w:t xml:space="preserve">What university labs, careers, or industries interest you?</w:t>
+      </w:r>
+    </w:p>
+    <w:p>
+      <w:pPr>
+        <w:keepNext w:val="0"/>
+        <w:widowControl/>
+        <w:spacing w:after="80" w:before="0" w:lineRule="auto" w:line="252"/>
+        <w:rPr>
+          <w:rFonts w:ascii="Arial" w:hAnsi="Arial" w:eastAsia="Arial" w:cs="Arial"/>
+        </w:rPr>
+      </w:pPr>
+      <w:r>
+        <w:rPr>
+          <w:rFonts w:ascii="Arial" w:hAnsi="Arial" w:eastAsia="Arial" w:cs="Arial"/>
+          <w:color w:val="111111"/>
+          <w:rtl w:val="0"/>
+        </w:rPr>
+        <w:t xml:space="preserve">Students end the week by listing their top five possible research areas.</w:t>
+      </w:r>
+    </w:p>
+    <w:p>
+      <w:pPr>
         <w:pStyle w:val="Heading2"/>
-        <w:keepNext w:val="0"/>
+        <w:keepNext/>
         <w:keepLines w:val="0"/>
-        <w:spacing w:after="80" w:lineRule="auto"/>
-        <w:rPr>
+        <w:widowControl/>
+        <w:spacing w:after="80" w:lineRule="auto" w:before="220" w:line="240"/>
+        <w:rPr>
+          <w:rFonts w:ascii="Arial" w:hAnsi="Arial" w:eastAsia="Arial" w:cs="Arial"/>
           <w:b w:val="1"/>
           <w:bCs w:val="1"/>
           <w:sz w:val="34"/>
           <w:szCs w:val="34"/>
         </w:rPr>
       </w:pPr>
-      <w:bookmarkStart w:colFirst="0" w:colLast="0" w:name="_vpknljyp7gd8" w:id="15"/>
-      <w:bookmarkEnd w:id="15"/>
+      <w:bookmarkStart w:colFirst="0" w:colLast="0" w:name="_v3fn182zg2r" w:id="22"/>
+      <w:bookmarkEnd w:id="22"/>
       <w:r>
         <w:rPr>
+          <w:rFonts w:ascii="Arial" w:hAnsi="Arial" w:eastAsia="Arial" w:cs="Arial"/>
+          <w:b/>
+          <w:bCs w:val="1"/>
+          <w:color w:val="E31B23"/>
+          <w:sz w:val="34"/>
+          <w:szCs w:val="34"/>
+          <w:rtl w:val="0"/>
+        </w:rPr>
+        <w:t xml:space="preserve">Week 1 Deliverables</w:t>
+      </w:r>
+    </w:p>
+    <w:p>
+      <w:pPr>
+        <w:keepNext w:val="0"/>
+        <w:widowControl/>
+        <w:numPr>
+          <w:ilvl w:val="0"/>
+          <w:numId w:val="73"/>
+        </w:numPr>
+        <w:pStyle w:val="ListBullet"/>
+        <w:spacing w:after="40" w:afterAutospacing="0" w:before="0" w:lineRule="auto" w:line="252"/>
+        <w:ind/>
+      </w:pPr>
+      <w:r>
+        <w:rPr>
+          <w:rFonts w:ascii="Arial" w:hAnsi="Arial" w:eastAsia="Arial" w:cs="Arial"/>
+          <w:color w:val="111111"/>
+          <w:rtl w:val="0"/>
+        </w:rPr>
+        <w:t xml:space="preserve">STARLAB course launch reflection</w:t>
+      </w:r>
+    </w:p>
+    <w:p>
+      <w:pPr>
+        <w:keepNext w:val="0"/>
+        <w:widowControl/>
+        <w:numPr>
+          <w:ilvl w:val="0"/>
+          <w:numId w:val="73"/>
+        </w:numPr>
+        <w:pStyle w:val="ListBullet"/>
+        <w:spacing w:after="40" w:afterAutospacing="0" w:before="0" w:beforeAutospacing="0" w:lineRule="auto" w:line="252"/>
+        <w:ind/>
+      </w:pPr>
+      <w:r>
+        <w:rPr>
+          <w:rFonts w:ascii="Arial" w:hAnsi="Arial" w:eastAsia="Arial" w:cs="Arial"/>
+          <w:color w:val="111111"/>
+          <w:rtl w:val="0"/>
+        </w:rPr>
+        <w:t xml:space="preserve">Science identity and skills inventory</w:t>
+      </w:r>
+    </w:p>
+    <w:p>
+      <w:pPr>
+        <w:keepNext w:val="0"/>
+        <w:widowControl/>
+        <w:numPr>
+          <w:ilvl w:val="0"/>
+          <w:numId w:val="73"/>
+        </w:numPr>
+        <w:pStyle w:val="ListBullet"/>
+        <w:spacing w:after="40" w:afterAutospacing="0" w:before="0" w:beforeAutospacing="0" w:lineRule="auto" w:line="252"/>
+        <w:ind/>
+      </w:pPr>
+      <w:r>
+        <w:rPr>
+          <w:rFonts w:ascii="Arial" w:hAnsi="Arial" w:eastAsia="Arial" w:cs="Arial"/>
+          <w:color w:val="111111"/>
+          <w:rtl w:val="0"/>
+        </w:rPr>
+        <w:t xml:space="preserve">Research ethics and integrity agreement</w:t>
+      </w:r>
+    </w:p>
+    <w:p>
+      <w:pPr>
+        <w:keepNext w:val="0"/>
+        <w:widowControl/>
+        <w:numPr>
+          <w:ilvl w:val="0"/>
+          <w:numId w:val="73"/>
+        </w:numPr>
+        <w:pStyle w:val="ListBullet"/>
+        <w:spacing w:after="40" w:afterAutospacing="0" w:before="0" w:beforeAutospacing="0" w:lineRule="auto" w:line="252"/>
+        <w:ind/>
+      </w:pPr>
+      <w:r>
+        <w:rPr>
+          <w:rFonts w:ascii="Arial" w:hAnsi="Arial" w:eastAsia="Arial" w:cs="Arial"/>
+          <w:color w:val="111111"/>
+          <w:rtl w:val="0"/>
+        </w:rPr>
+        <w:t xml:space="preserve">Research interest inventory</w:t>
+      </w:r>
+    </w:p>
+    <w:p>
+      <w:pPr>
+        <w:keepNext w:val="0"/>
+        <w:widowControl/>
+        <w:numPr>
+          <w:ilvl w:val="0"/>
+          <w:numId w:val="73"/>
+        </w:numPr>
+        <w:pStyle w:val="ListBullet"/>
+        <w:spacing w:after="40" w:before="0" w:beforeAutospacing="0" w:lineRule="auto" w:line="252"/>
+        <w:ind/>
+      </w:pPr>
+      <w:r>
+        <w:rPr>
+          <w:rFonts w:ascii="Arial" w:hAnsi="Arial" w:eastAsia="Arial" w:cs="Arial"/>
+          <w:color w:val="111111"/>
+          <w:rtl w:val="0"/>
+        </w:rPr>
+        <w:t xml:space="preserve">Top five possible research areas</w:t>
+      </w:r>
+    </w:p>
+    <w:p>
+      <w:pPr>
+        <w:pStyle w:val="Heading2"/>
+        <w:keepNext/>
+        <w:keepLines w:val="0"/>
+        <w:widowControl/>
+        <w:spacing w:after="80" w:lineRule="auto" w:before="220" w:line="240"/>
+        <w:rPr>
+          <w:rFonts w:ascii="Arial" w:hAnsi="Arial" w:eastAsia="Arial" w:cs="Arial"/>
           <w:b w:val="1"/>
           <w:bCs w:val="1"/>
           <w:sz w:val="34"/>
           <w:szCs w:val="34"/>
-          <w:rtl w:val="0"/>
-        </w:rPr>
-        <w:t xml:space="preserve">Teacher Materials</w:t>
-      </w:r>
-    </w:p>
-    <w:p>
-      <w:pPr/>
-      <w:r>
-        <w:t>Deck Use: Primary - Deck 1: Authentic Research and Course Launch; Deck 3: Research Ethics, Safety, and Integrity</w:t>
-      </w:r>
-    </w:p>
-    <w:p>
-      <w:pPr>
-        <w:numPr>
-          <w:ilvl w:val="0"/>
-          <w:numId w:val="13"/>
-        </w:numPr>
-        <w:spacing w:after="0" w:afterAutospacing="0" w:before="240" w:lineRule="auto"/>
-        <w:ind w:left="720" w:hanging="360"/>
-      </w:pPr>
-      <w:r>
-        <w:rPr>
-          <w:rtl w:val="0"/>
-        </w:rPr>
-        <w:t xml:space="preserve">STARLAB syllabus or course overview</w:t>
-      </w:r>
-    </w:p>
-    <w:p>
-      <w:pPr>
-        <w:numPr>
-          <w:ilvl w:val="0"/>
-          <w:numId w:val="13"/>
-        </w:numPr>
-        <w:spacing w:after="0" w:afterAutospacing="0" w:before="0" w:beforeAutospacing="0" w:lineRule="auto"/>
-        <w:ind w:left="720" w:hanging="360"/>
-      </w:pPr>
-      <w:r>
-        <w:rPr>
-          <w:rtl w:val="0"/>
-        </w:rPr>
-        <w:t xml:space="preserve">Student Handout 1: STARLAB Course Launch Reflection</w:t>
-      </w:r>
-    </w:p>
-    <w:p>
-      <w:pPr>
-        <w:numPr>
-          <w:ilvl w:val="0"/>
-          <w:numId w:val="13"/>
-        </w:numPr>
-        <w:spacing w:after="0" w:afterAutospacing="0" w:before="0" w:beforeAutospacing="0" w:lineRule="auto"/>
-        <w:ind w:left="720" w:hanging="360"/>
-      </w:pPr>
-      <w:r>
-        <w:rPr>
-          <w:rtl w:val="0"/>
-        </w:rPr>
-        <w:t xml:space="preserve">Student Handout 2: Science Identity and Skills Inventory</w:t>
-      </w:r>
-    </w:p>
-    <w:p>
-      <w:pPr>
-        <w:numPr>
-          <w:ilvl w:val="0"/>
-          <w:numId w:val="13"/>
-        </w:numPr>
-        <w:spacing w:after="0" w:afterAutospacing="0" w:before="0" w:beforeAutospacing="0" w:lineRule="auto"/>
-        <w:ind w:left="720" w:hanging="360"/>
-      </w:pPr>
-      <w:r>
-        <w:rPr>
-          <w:rtl w:val="0"/>
-        </w:rPr>
-        <w:t xml:space="preserve">Student Handout 3: Research Interest Inventory</w:t>
-      </w:r>
-    </w:p>
-    <w:p>
-      <w:pPr>
-        <w:numPr>
-          <w:ilvl w:val="0"/>
-          <w:numId w:val="13"/>
-        </w:numPr>
-        <w:spacing w:after="0" w:afterAutospacing="0" w:before="0" w:beforeAutospacing="0" w:lineRule="auto"/>
-        <w:ind w:left="720" w:hanging="360"/>
-      </w:pPr>
-      <w:r>
-        <w:rPr>
-          <w:rtl w:val="0"/>
-        </w:rPr>
-        <w:t xml:space="preserve">Student Handout 4: Research Ethics and Integrity Agreement</w:t>
-      </w:r>
-    </w:p>
-    <w:p>
-      <w:pPr>
-        <w:numPr>
-          <w:ilvl w:val="0"/>
-          <w:numId w:val="13"/>
-        </w:numPr>
-        <w:spacing w:after="0" w:afterAutospacing="0" w:before="0" w:beforeAutospacing="0" w:lineRule="auto"/>
-        <w:ind w:left="720" w:hanging="360"/>
-      </w:pPr>
-      <w:r>
-        <w:rPr>
-          <w:rtl w:val="0"/>
-        </w:rPr>
-        <w:t xml:space="preserve">Appendix A: What Counts as Research?</w:t>
-      </w:r>
-    </w:p>
-    <w:p>
-      <w:pPr>
-        <w:numPr>
-          <w:ilvl w:val="0"/>
-          <w:numId w:val="13"/>
-        </w:numPr>
-        <w:spacing w:after="0" w:afterAutospacing="0" w:before="0" w:beforeAutospacing="0" w:lineRule="auto"/>
-        <w:ind w:left="720" w:hanging="360"/>
-      </w:pPr>
-      <w:r>
-        <w:rPr>
-          <w:rtl w:val="0"/>
-        </w:rPr>
-        <w:t xml:space="preserve">Appendix B: STARLAB Classroom Norms</w:t>
-      </w:r>
-    </w:p>
-    <w:p>
-      <w:pPr>
-        <w:numPr>
-          <w:ilvl w:val="0"/>
-          <w:numId w:val="13"/>
-        </w:numPr>
-        <w:spacing w:after="240" w:before="0" w:beforeAutospacing="0" w:lineRule="auto"/>
-        <w:ind w:left="720" w:hanging="360"/>
-      </w:pPr>
-      <w:r>
-        <w:rPr>
-          <w:rtl w:val="0"/>
-        </w:rPr>
-        <w:t xml:space="preserve">Appendix C: Research Fields and Topic Bank</w:t>
-      </w:r>
-    </w:p>
-    <w:p>
-      <w:pPr/>
-      <w:r>
-        <w:t>Optional / Teacher Reference - Appendix I: Optional Project Card Sorting Activity</w:t>
-      </w:r>
-    </w:p>
-    <w:p>
-      <w:pPr/>
-      <w:r>
-        <w:t>Optional / Teacher Reference - Appendix J: Optional Initial Parent or Guardian Communication</w:t>
-      </w:r>
-    </w:p>
-    <w:p>
-      <w:pPr/>
-      <w:r>
-        <w:t>Optional / Teacher Reference - Appendix L: Differentiation and Implementation Notes</w:t>
-      </w:r>
-    </w:p>
-    <w:p>
-      <w:pPr>
-        <w:pStyle w:val="Heading2"/>
-        <w:keepNext w:val="0"/>
-        <w:keepLines w:val="0"/>
-        <w:spacing w:after="80" w:lineRule="auto"/>
-        <w:rPr>
-          <w:b w:val="1"/>
-          <w:bCs w:val="1"/>
-          <w:sz w:val="34"/>
-          <w:szCs w:val="34"/>
-        </w:rPr>
-      </w:pPr>
-      <w:bookmarkStart w:colFirst="0" w:colLast="0" w:name="_l0nqib5vt55f" w:id="16"/>
-      <w:bookmarkEnd w:id="16"/>
-      <w:r>
-        <w:rPr>
-          <w:b w:val="1"/>
-          <w:bCs w:val="1"/>
-          <w:sz w:val="34"/>
-          <w:szCs w:val="34"/>
-          <w:rtl w:val="0"/>
-        </w:rPr>
-        <w:t xml:space="preserve">Suggested Weekly Flow</w:t>
-      </w:r>
-    </w:p>
-    <w:p>
-      <w:pPr>
-        <w:pStyle w:val="Heading3"/>
-        <w:keepNext w:val="0"/>
-        <w:keepLines w:val="0"/>
-        <w:spacing w:before="280" w:lineRule="auto"/>
-        <w:rPr>
-          <w:b w:val="1"/>
-          <w:bCs w:val="1"/>
-          <w:color w:val="000000"/>
-          <w:sz w:val="26"/>
-          <w:szCs w:val="26"/>
-        </w:rPr>
-      </w:pPr>
-      <w:bookmarkStart w:colFirst="0" w:colLast="0" w:name="_9gtt5xbhjinc" w:id="17"/>
-      <w:bookmarkEnd w:id="17"/>
-      <w:r>
-        <w:rPr>
-          <w:b w:val="1"/>
-          <w:bCs w:val="1"/>
-          <w:color w:val="000000"/>
-          <w:sz w:val="26"/>
-          <w:szCs w:val="26"/>
-          <w:rtl w:val="0"/>
-        </w:rPr>
-        <w:t xml:space="preserve">Day 1: Course Launch — What Is STARLAB?</w:t>
-      </w:r>
-    </w:p>
-    <w:p>
-      <w:pPr>
-        <w:spacing w:after="240" w:before="240" w:lineRule="auto"/>
-        <w:rPr/>
-      </w:pPr>
-      <w:r>
-        <w:rPr>
-          <w:rtl w:val="0"/>
-        </w:rPr>
-        <w:t xml:space="preserve">Begin with a short teacher introduction to the purpose of STARLAB. Emphasize that students will spend the year developing and communicating an original research or engineering project. STARLAB should be framed as a bridge between high school science and authentic scientific or engineering practice.</w:t>
-      </w:r>
-    </w:p>
-    <w:p>
-      <w:pPr>
-        <w:spacing w:after="240" w:before="240" w:lineRule="auto"/>
-        <w:rPr/>
-      </w:pPr>
-      <w:r>
-        <w:rPr>
-          <w:rtl w:val="0"/>
-        </w:rPr>
-        <w:t xml:space="preserve">Suggested teacher framing:</w:t>
-      </w:r>
-    </w:p>
-    <w:p>
-      <w:pPr>
-        <w:spacing w:after="240" w:before="240" w:lineRule="auto"/>
-        <w:rPr/>
-      </w:pPr>
-      <w:r>
-        <w:rPr>
-          <w:rtl w:val="0"/>
-        </w:rPr>
-        <w:t xml:space="preserve">“STARLAB is not a course where I give everyone the same lab and everyone knows the correct answer before starting. This course is about learning how to ask better questions, design better investigations, work through uncertainty, and communicate findings professionally. By the end of the course, your goal is not only to complete a project, but to understand your work well enough to explain and defend it.”</w:t>
-      </w:r>
-    </w:p>
-    <w:p>
-      <w:pPr>
-        <w:spacing w:after="240" w:before="240" w:lineRule="auto"/>
-        <w:rPr/>
-      </w:pPr>
-      <w:r>
-        <w:rPr>
-          <w:rtl w:val="0"/>
-        </w:rPr>
-        <w:t xml:space="preserve">Give students a brief overview of the yearlong arc:</w:t>
-      </w:r>
-    </w:p>
-    <w:p>
-      <w:pPr>
-        <w:numPr>
-          <w:ilvl w:val="0"/>
-          <w:numId w:val="34"/>
-        </w:numPr>
-        <w:spacing w:after="0" w:afterAutospacing="0" w:before="240" w:lineRule="auto"/>
-        <w:ind w:left="720" w:hanging="360"/>
-      </w:pPr>
-      <w:r>
-        <w:rPr>
-          <w:rtl w:val="0"/>
-        </w:rPr>
-        <w:t xml:space="preserve">Research foundations and question development</w:t>
-      </w:r>
-    </w:p>
-    <w:p>
-      <w:pPr>
-        <w:numPr>
-          <w:ilvl w:val="0"/>
-          <w:numId w:val="34"/>
-        </w:numPr>
-        <w:spacing w:after="0" w:afterAutospacing="0" w:before="0" w:beforeAutospacing="0" w:lineRule="auto"/>
-        <w:ind w:left="720" w:hanging="360"/>
-      </w:pPr>
-      <w:r>
-        <w:rPr>
-          <w:rtl w:val="0"/>
-        </w:rPr>
-        <w:t xml:space="preserve">Project planning and safety</w:t>
-      </w:r>
-    </w:p>
-    <w:p>
-      <w:pPr>
-        <w:numPr>
-          <w:ilvl w:val="0"/>
-          <w:numId w:val="34"/>
-        </w:numPr>
-        <w:spacing w:after="0" w:afterAutospacing="0" w:before="0" w:beforeAutospacing="0" w:lineRule="auto"/>
-        <w:ind w:left="720" w:hanging="360"/>
-      </w:pPr>
-      <w:r>
-        <w:rPr>
-          <w:rtl w:val="0"/>
-        </w:rPr>
-        <w:t xml:space="preserve">Pilot testing and data collection</w:t>
-      </w:r>
-    </w:p>
-    <w:p>
-      <w:pPr>
-        <w:numPr>
-          <w:ilvl w:val="0"/>
-          <w:numId w:val="34"/>
-        </w:numPr>
-        <w:spacing w:after="0" w:afterAutospacing="0" w:before="0" w:beforeAutospacing="0" w:lineRule="auto"/>
-        <w:ind w:left="720" w:hanging="360"/>
-      </w:pPr>
-      <w:r>
-        <w:rPr>
-          <w:rtl w:val="0"/>
-        </w:rPr>
-        <w:t xml:space="preserve">Data analysis and interpretation</w:t>
-      </w:r>
-    </w:p>
-    <w:p>
-      <w:pPr>
-        <w:numPr>
-          <w:ilvl w:val="0"/>
-          <w:numId w:val="34"/>
-        </w:numPr>
-        <w:spacing w:after="0" w:afterAutospacing="0" w:before="0" w:beforeAutospacing="0" w:lineRule="auto"/>
-        <w:ind w:left="720" w:hanging="360"/>
-      </w:pPr>
-      <w:r>
-        <w:rPr>
-          <w:rtl w:val="0"/>
-        </w:rPr>
-        <w:t xml:space="preserve">Scientific reporting and presentation preparation</w:t>
-      </w:r>
-    </w:p>
-    <w:p>
-      <w:pPr>
-        <w:numPr>
-          <w:ilvl w:val="0"/>
-          <w:numId w:val="34"/>
-        </w:numPr>
-        <w:spacing w:after="240" w:before="0" w:beforeAutospacing="0" w:lineRule="auto"/>
-        <w:ind w:left="720" w:hanging="360"/>
-      </w:pPr>
-      <w:r>
-        <w:rPr>
-          <w:rtl w:val="0"/>
-        </w:rPr>
-        <w:t xml:space="preserve">Public presentation and reflection</w:t>
-      </w:r>
-    </w:p>
-    <w:p>
-      <w:pPr>
-        <w:spacing w:after="240" w:before="240" w:lineRule="auto"/>
-        <w:rPr/>
-      </w:pPr>
-      <w:r>
-        <w:rPr>
-          <w:rtl w:val="0"/>
-        </w:rPr>
-        <w:t xml:space="preserve">Students complete Student Handout 1: STARLAB Course Launch Reflection.</w:t>
-      </w:r>
-    </w:p>
-    <w:p>
-      <w:pPr>
-        <w:spacing w:after="240" w:before="240" w:lineRule="auto"/>
-        <w:rPr/>
-      </w:pPr>
-      <w:r>
-        <w:rPr>
-          <w:rtl w:val="0"/>
-        </w:rPr>
-        <w:t xml:space="preserve">Discussion questions:</w:t>
-      </w:r>
-    </w:p>
-    <w:p>
-      <w:pPr>
-        <w:numPr>
-          <w:ilvl w:val="0"/>
-          <w:numId w:val="67"/>
-        </w:numPr>
-        <w:spacing w:after="0" w:afterAutospacing="0" w:before="240" w:lineRule="auto"/>
-        <w:ind w:left="720" w:hanging="360"/>
-      </w:pPr>
-      <w:r>
-        <w:rPr>
-          <w:rtl w:val="0"/>
-        </w:rPr>
-        <w:t xml:space="preserve">What parts of this course sound exciting?</w:t>
-      </w:r>
-    </w:p>
-    <w:p>
-      <w:pPr>
-        <w:numPr>
-          <w:ilvl w:val="0"/>
-          <w:numId w:val="67"/>
-        </w:numPr>
-        <w:spacing w:after="0" w:afterAutospacing="0" w:before="0" w:beforeAutospacing="0" w:lineRule="auto"/>
-        <w:ind w:left="720" w:hanging="360"/>
-      </w:pPr>
-      <w:r>
-        <w:rPr>
-          <w:rtl w:val="0"/>
-        </w:rPr>
-        <w:t xml:space="preserve">What parts sound intimidating?</w:t>
-      </w:r>
-    </w:p>
-    <w:p>
-      <w:pPr>
-        <w:numPr>
-          <w:ilvl w:val="0"/>
-          <w:numId w:val="67"/>
-        </w:numPr>
-        <w:spacing w:after="0" w:afterAutospacing="0" w:before="0" w:beforeAutospacing="0" w:lineRule="auto"/>
-        <w:ind w:left="720" w:hanging="360"/>
-      </w:pPr>
-      <w:r>
-        <w:rPr>
-          <w:rtl w:val="0"/>
-        </w:rPr>
-        <w:t xml:space="preserve">What does it mean to work on a project where the teacher does not already know the answer?</w:t>
-      </w:r>
-    </w:p>
-    <w:p>
-      <w:pPr>
-        <w:numPr>
-          <w:ilvl w:val="0"/>
-          <w:numId w:val="67"/>
-        </w:numPr>
-        <w:spacing w:after="240" w:before="0" w:beforeAutospacing="0" w:lineRule="auto"/>
-        <w:ind w:left="720" w:hanging="360"/>
-      </w:pPr>
-      <w:r>
-        <w:rPr>
-          <w:rtl w:val="0"/>
-        </w:rPr>
-        <w:t xml:space="preserve">How should students support one another in a research-based class?</w:t>
-      </w:r>
-    </w:p>
-    <w:p>
-      <w:pPr>
-        <w:pStyle w:val="Heading3"/>
-        <w:keepNext w:val="0"/>
-        <w:keepLines w:val="0"/>
-        <w:spacing w:before="280" w:lineRule="auto"/>
-        <w:rPr>
-          <w:b w:val="1"/>
-          <w:bCs w:val="1"/>
-          <w:color w:val="000000"/>
-          <w:sz w:val="26"/>
-          <w:szCs w:val="26"/>
-        </w:rPr>
-      </w:pPr>
-      <w:bookmarkStart w:colFirst="0" w:colLast="0" w:name="_1jwcej3q38zb" w:id="18"/>
-      <w:bookmarkEnd w:id="18"/>
-      <w:r>
-        <w:rPr>
-          <w:b w:val="1"/>
-          <w:bCs w:val="1"/>
-          <w:color w:val="000000"/>
-          <w:sz w:val="26"/>
-          <w:szCs w:val="26"/>
-          <w:rtl w:val="0"/>
-        </w:rPr>
-        <w:t xml:space="preserve">Day 2: What Counts as Scientific Research?</w:t>
-      </w:r>
-    </w:p>
-    <w:p>
-      <w:pPr>
-        <w:spacing w:after="240" w:before="240" w:lineRule="auto"/>
-        <w:rPr/>
-      </w:pPr>
-      <w:r>
-        <w:rPr>
-          <w:rtl w:val="0"/>
-        </w:rPr>
-        <w:t xml:space="preserve">Use Appendix A to guide a discussion on the difference between demonstrations, classroom labs, engineering builds, science fair projects, and authentic research.</w:t>
-      </w:r>
-    </w:p>
-    <w:p>
-      <w:pPr>
-        <w:spacing w:after="240" w:before="240" w:lineRule="auto"/>
-        <w:rPr/>
-      </w:pPr>
-      <w:r>
-        <w:rPr>
-          <w:rtl w:val="0"/>
-        </w:rPr>
-        <w:t xml:space="preserve">Students should understand that research can take many forms, including:</w:t>
-      </w:r>
-    </w:p>
-    <w:p>
-      <w:pPr>
-        <w:numPr>
-          <w:ilvl w:val="0"/>
-          <w:numId w:val="33"/>
-        </w:numPr>
-        <w:spacing w:after="0" w:afterAutospacing="0" w:before="240" w:lineRule="auto"/>
-        <w:ind w:left="720" w:hanging="360"/>
-      </w:pPr>
-      <w:r>
-        <w:rPr>
-          <w:rtl w:val="0"/>
-        </w:rPr>
-        <w:t xml:space="preserve">Controlled experiments</w:t>
-      </w:r>
-    </w:p>
-    <w:p>
-      <w:pPr>
-        <w:numPr>
-          <w:ilvl w:val="0"/>
-          <w:numId w:val="33"/>
-        </w:numPr>
-        <w:spacing w:after="0" w:afterAutospacing="0" w:before="0" w:beforeAutospacing="0" w:lineRule="auto"/>
-        <w:ind w:left="720" w:hanging="360"/>
-      </w:pPr>
-      <w:r>
-        <w:rPr>
-          <w:rtl w:val="0"/>
-        </w:rPr>
-        <w:t xml:space="preserve">Engineering design and testing</w:t>
-      </w:r>
-    </w:p>
-    <w:p>
-      <w:pPr>
-        <w:numPr>
-          <w:ilvl w:val="0"/>
-          <w:numId w:val="33"/>
-        </w:numPr>
-        <w:spacing w:after="0" w:afterAutospacing="0" w:before="0" w:beforeAutospacing="0" w:lineRule="auto"/>
-        <w:ind w:left="720" w:hanging="360"/>
-      </w:pPr>
-      <w:r>
-        <w:rPr>
-          <w:rtl w:val="0"/>
-        </w:rPr>
-        <w:t xml:space="preserve">Computational modeling</w:t>
-      </w:r>
-    </w:p>
-    <w:p>
-      <w:pPr>
-        <w:numPr>
-          <w:ilvl w:val="0"/>
-          <w:numId w:val="33"/>
-        </w:numPr>
-        <w:spacing w:after="0" w:afterAutospacing="0" w:before="0" w:beforeAutospacing="0" w:lineRule="auto"/>
-        <w:ind w:left="720" w:hanging="360"/>
-      </w:pPr>
-      <w:r>
-        <w:rPr>
-          <w:rtl w:val="0"/>
-        </w:rPr>
-        <w:t xml:space="preserve">Field observations</w:t>
-      </w:r>
-    </w:p>
-    <w:p>
-      <w:pPr>
-        <w:numPr>
-          <w:ilvl w:val="0"/>
-          <w:numId w:val="33"/>
-        </w:numPr>
-        <w:spacing w:after="0" w:afterAutospacing="0" w:before="0" w:beforeAutospacing="0" w:lineRule="auto"/>
-        <w:ind w:left="720" w:hanging="360"/>
-      </w:pPr>
-      <w:r>
-        <w:rPr>
-          <w:rtl w:val="0"/>
-        </w:rPr>
-        <w:t xml:space="preserve">Materials testing</w:t>
-      </w:r>
-    </w:p>
-    <w:p>
-      <w:pPr>
-        <w:numPr>
-          <w:ilvl w:val="0"/>
-          <w:numId w:val="33"/>
-        </w:numPr>
-        <w:spacing w:after="0" w:afterAutospacing="0" w:before="0" w:beforeAutospacing="0" w:lineRule="auto"/>
-        <w:ind w:left="720" w:hanging="360"/>
-      </w:pPr>
-      <w:r>
-        <w:rPr>
-          <w:rtl w:val="0"/>
-        </w:rPr>
-        <w:t xml:space="preserve">Survey-based research, when ethically appropriate</w:t>
-      </w:r>
-    </w:p>
-    <w:p>
-      <w:pPr>
-        <w:numPr>
-          <w:ilvl w:val="0"/>
-          <w:numId w:val="33"/>
-        </w:numPr>
-        <w:spacing w:after="0" w:afterAutospacing="0" w:before="0" w:beforeAutospacing="0" w:lineRule="auto"/>
-        <w:ind w:left="720" w:hanging="360"/>
-      </w:pPr>
-      <w:r>
-        <w:rPr>
-          <w:rtl w:val="0"/>
-        </w:rPr>
-        <w:t xml:space="preserve">Data analysis using existing datasets</w:t>
-      </w:r>
-    </w:p>
-    <w:p>
-      <w:pPr>
-        <w:numPr>
-          <w:ilvl w:val="0"/>
-          <w:numId w:val="33"/>
-        </w:numPr>
-        <w:spacing w:after="240" w:before="0" w:beforeAutospacing="0" w:lineRule="auto"/>
-        <w:ind w:left="720" w:hanging="360"/>
-      </w:pPr>
-      <w:r>
-        <w:rPr>
-          <w:rtl w:val="0"/>
-        </w:rPr>
-        <w:t xml:space="preserve">Prototype development</w:t>
-      </w:r>
-    </w:p>
-    <w:p>
-      <w:pPr>
-        <w:spacing w:after="240" w:before="240" w:lineRule="auto"/>
-        <w:rPr/>
-      </w:pPr>
-      <w:r>
-        <w:rPr>
-          <w:rtl w:val="0"/>
-        </w:rPr>
-        <w:t xml:space="preserve">Activity: Sort the Project Cards</w:t>
-      </w:r>
-    </w:p>
-    <w:p>
-      <w:pPr>
-        <w:spacing w:after="240" w:before="240" w:lineRule="auto"/>
-        <w:rPr/>
-      </w:pPr>
-      <w:r>
-        <w:rPr>
-          <w:rtl w:val="0"/>
-        </w:rPr>
-        <w:t xml:space="preserve">Provide students with brief descriptions of possible student projects. Students sort them into categories:</w:t>
-      </w:r>
-    </w:p>
-    <w:p>
-      <w:pPr>
-        <w:numPr>
-          <w:ilvl w:val="0"/>
-          <w:numId w:val="18"/>
-        </w:numPr>
-        <w:spacing w:after="0" w:afterAutospacing="0" w:before="240" w:lineRule="auto"/>
-        <w:ind w:left="720" w:hanging="360"/>
-      </w:pPr>
-      <w:r>
-        <w:rPr>
-          <w:rtl w:val="0"/>
-        </w:rPr>
-        <w:t xml:space="preserve">Not research yet</w:t>
-      </w:r>
-    </w:p>
-    <w:p>
-      <w:pPr>
-        <w:numPr>
-          <w:ilvl w:val="0"/>
-          <w:numId w:val="18"/>
-        </w:numPr>
-        <w:spacing w:after="0" w:afterAutospacing="0" w:before="0" w:beforeAutospacing="0" w:lineRule="auto"/>
-        <w:ind w:left="720" w:hanging="360"/>
-      </w:pPr>
-      <w:r>
-        <w:rPr>
-          <w:rtl w:val="0"/>
-        </w:rPr>
-        <w:t xml:space="preserve">Possible research, but needs refinement</w:t>
-      </w:r>
-    </w:p>
-    <w:p>
-      <w:pPr>
-        <w:numPr>
-          <w:ilvl w:val="0"/>
-          <w:numId w:val="18"/>
-        </w:numPr>
-        <w:spacing w:after="0" w:afterAutospacing="0" w:before="0" w:beforeAutospacing="0" w:lineRule="auto"/>
-        <w:ind w:left="720" w:hanging="360"/>
-      </w:pPr>
-      <w:r>
-        <w:rPr>
-          <w:rtl w:val="0"/>
-        </w:rPr>
-        <w:t xml:space="preserve">Strong research direction</w:t>
-      </w:r>
-    </w:p>
-    <w:p>
-      <w:pPr>
-        <w:numPr>
-          <w:ilvl w:val="0"/>
-          <w:numId w:val="18"/>
-        </w:numPr>
-        <w:spacing w:after="0" w:afterAutospacing="0" w:before="0" w:beforeAutospacing="0" w:lineRule="auto"/>
-        <w:ind w:left="720" w:hanging="360"/>
-      </w:pPr>
-      <w:r>
-        <w:rPr>
-          <w:rtl w:val="0"/>
-        </w:rPr>
-        <w:t xml:space="preserve">Engineering design project</w:t>
-      </w:r>
-    </w:p>
-    <w:p>
-      <w:pPr>
-        <w:numPr>
-          <w:ilvl w:val="0"/>
-          <w:numId w:val="18"/>
-        </w:numPr>
-        <w:spacing w:after="240" w:before="0" w:beforeAutospacing="0" w:lineRule="auto"/>
-        <w:ind w:left="720" w:hanging="360"/>
-      </w:pPr>
-      <w:r>
-        <w:rPr>
-          <w:rtl w:val="0"/>
-        </w:rPr>
-        <w:t xml:space="preserve">Ethically or practically problematic</w:t>
-      </w:r>
-    </w:p>
-    <w:p>
-      <w:pPr>
-        <w:spacing w:after="240" w:before="240" w:lineRule="auto"/>
-        <w:rPr/>
-      </w:pPr>
-      <w:r>
-        <w:rPr>
-          <w:rtl w:val="0"/>
-        </w:rPr>
-        <w:t xml:space="preserve">After sorting, students explain what made each project strong, weak, feasible, or problematic.</w:t>
-      </w:r>
-    </w:p>
-    <w:p>
-      <w:pPr>
-        <w:pStyle w:val="Heading3"/>
-        <w:keepNext w:val="0"/>
-        <w:keepLines w:val="0"/>
-        <w:spacing w:before="280" w:lineRule="auto"/>
-        <w:rPr>
-          <w:b w:val="1"/>
-          <w:bCs w:val="1"/>
-          <w:color w:val="000000"/>
-          <w:sz w:val="26"/>
-          <w:szCs w:val="26"/>
-        </w:rPr>
-      </w:pPr>
-      <w:bookmarkStart w:colFirst="0" w:colLast="0" w:name="_nq7sbpwceofa" w:id="19"/>
-      <w:bookmarkEnd w:id="19"/>
-      <w:r>
-        <w:rPr>
-          <w:b w:val="1"/>
-          <w:bCs w:val="1"/>
-          <w:color w:val="000000"/>
-          <w:sz w:val="26"/>
-          <w:szCs w:val="26"/>
-          <w:rtl w:val="0"/>
-        </w:rPr>
-        <w:t xml:space="preserve">Day 3: Science Identity and Skills Inventory</w:t>
-      </w:r>
-    </w:p>
-    <w:p>
-      <w:pPr>
-        <w:spacing w:after="240" w:before="240" w:lineRule="auto"/>
-        <w:rPr/>
-      </w:pPr>
-      <w:r>
-        <w:rPr>
-          <w:rtl w:val="0"/>
-        </w:rPr>
-        <w:t xml:space="preserve">Students complete Student Handout 2: Science Identity and Skills Inventory.</w:t>
-      </w:r>
-    </w:p>
-    <w:p>
-      <w:pPr>
-        <w:spacing w:after="240" w:before="240" w:lineRule="auto"/>
-        <w:rPr/>
-      </w:pPr>
-      <w:r>
-        <w:rPr>
-          <w:rtl w:val="0"/>
-        </w:rPr>
-        <w:t xml:space="preserve">This activity helps students identify strengths that may not always appear in traditional science classes, such as building, coding, drawing, organizing, communicating, troubleshooting, observing, or working patiently through repeated failure.</w:t>
-      </w:r>
-    </w:p>
-    <w:p>
-      <w:pPr>
-        <w:spacing w:after="240" w:before="240" w:lineRule="auto"/>
-        <w:rPr/>
-      </w:pPr>
-      <w:r>
-        <w:rPr>
-          <w:rtl w:val="0"/>
-        </w:rPr>
-        <w:t xml:space="preserve">Teacher should emphasize that STARLAB needs many kinds of thinkers:</w:t>
-      </w:r>
-    </w:p>
-    <w:p>
-      <w:pPr>
-        <w:numPr>
-          <w:ilvl w:val="0"/>
-          <w:numId w:val="49"/>
-        </w:numPr>
-        <w:spacing w:after="0" w:afterAutospacing="0" w:before="240" w:lineRule="auto"/>
-        <w:ind w:left="720" w:hanging="360"/>
-      </w:pPr>
-      <w:r>
-        <w:rPr>
-          <w:rtl w:val="0"/>
-        </w:rPr>
-        <w:t xml:space="preserve">The careful measurer</w:t>
-      </w:r>
-    </w:p>
-    <w:p>
-      <w:pPr>
-        <w:numPr>
-          <w:ilvl w:val="0"/>
-          <w:numId w:val="49"/>
-        </w:numPr>
-        <w:spacing w:after="0" w:afterAutospacing="0" w:before="0" w:beforeAutospacing="0" w:lineRule="auto"/>
-        <w:ind w:left="720" w:hanging="360"/>
-      </w:pPr>
-      <w:r>
-        <w:rPr>
-          <w:rtl w:val="0"/>
-        </w:rPr>
-        <w:t xml:space="preserve">The builder</w:t>
-      </w:r>
-    </w:p>
-    <w:p>
-      <w:pPr>
-        <w:numPr>
-          <w:ilvl w:val="0"/>
-          <w:numId w:val="49"/>
-        </w:numPr>
-        <w:spacing w:after="0" w:afterAutospacing="0" w:before="0" w:beforeAutospacing="0" w:lineRule="auto"/>
-        <w:ind w:left="720" w:hanging="360"/>
-      </w:pPr>
-      <w:r>
-        <w:rPr>
-          <w:rtl w:val="0"/>
-        </w:rPr>
-        <w:t xml:space="preserve">The coder</w:t>
-      </w:r>
-    </w:p>
-    <w:p>
-      <w:pPr>
-        <w:numPr>
-          <w:ilvl w:val="0"/>
-          <w:numId w:val="49"/>
-        </w:numPr>
-        <w:spacing w:after="0" w:afterAutospacing="0" w:before="0" w:beforeAutospacing="0" w:lineRule="auto"/>
-        <w:ind w:left="720" w:hanging="360"/>
-      </w:pPr>
-      <w:r>
-        <w:rPr>
-          <w:rtl w:val="0"/>
-        </w:rPr>
-        <w:t xml:space="preserve">The artist/designer</w:t>
-      </w:r>
-    </w:p>
-    <w:p>
-      <w:pPr>
-        <w:numPr>
-          <w:ilvl w:val="0"/>
-          <w:numId w:val="49"/>
-        </w:numPr>
-        <w:spacing w:after="0" w:afterAutospacing="0" w:before="0" w:beforeAutospacing="0" w:lineRule="auto"/>
-        <w:ind w:left="720" w:hanging="360"/>
-      </w:pPr>
-      <w:r>
-        <w:rPr>
-          <w:rtl w:val="0"/>
-        </w:rPr>
-        <w:t xml:space="preserve">The organizer</w:t>
-      </w:r>
-    </w:p>
-    <w:p>
-      <w:pPr>
-        <w:numPr>
-          <w:ilvl w:val="0"/>
-          <w:numId w:val="49"/>
-        </w:numPr>
-        <w:spacing w:after="0" w:afterAutospacing="0" w:before="0" w:beforeAutospacing="0" w:lineRule="auto"/>
-        <w:ind w:left="720" w:hanging="360"/>
-      </w:pPr>
-      <w:r>
-        <w:rPr>
-          <w:rtl w:val="0"/>
-        </w:rPr>
-        <w:t xml:space="preserve">The question asker</w:t>
-      </w:r>
-    </w:p>
-    <w:p>
-      <w:pPr>
-        <w:numPr>
-          <w:ilvl w:val="0"/>
-          <w:numId w:val="49"/>
-        </w:numPr>
-        <w:spacing w:after="0" w:afterAutospacing="0" w:before="0" w:beforeAutospacing="0" w:lineRule="auto"/>
-        <w:ind w:left="720" w:hanging="360"/>
-      </w:pPr>
-      <w:r>
-        <w:rPr>
-          <w:rtl w:val="0"/>
-        </w:rPr>
-        <w:t xml:space="preserve">The troubleshooter</w:t>
-      </w:r>
-    </w:p>
-    <w:p>
-      <w:pPr>
-        <w:numPr>
-          <w:ilvl w:val="0"/>
-          <w:numId w:val="49"/>
-        </w:numPr>
-        <w:spacing w:after="0" w:afterAutospacing="0" w:before="0" w:beforeAutospacing="0" w:lineRule="auto"/>
-        <w:ind w:left="720" w:hanging="360"/>
-      </w:pPr>
-      <w:r>
-        <w:rPr>
-          <w:rtl w:val="0"/>
-        </w:rPr>
-        <w:t xml:space="preserve">The communicator</w:t>
-      </w:r>
-    </w:p>
-    <w:p>
-      <w:pPr>
-        <w:numPr>
-          <w:ilvl w:val="0"/>
-          <w:numId w:val="49"/>
-        </w:numPr>
-        <w:spacing w:after="240" w:before="0" w:beforeAutospacing="0" w:lineRule="auto"/>
-        <w:ind w:left="720" w:hanging="360"/>
-      </w:pPr>
-      <w:r>
-        <w:rPr>
-          <w:rtl w:val="0"/>
-        </w:rPr>
-        <w:t xml:space="preserve">The patient observer</w:t>
-      </w:r>
-    </w:p>
-    <w:p>
-      <w:pPr>
-        <w:spacing w:after="240" w:before="240" w:lineRule="auto"/>
-        <w:rPr/>
-      </w:pPr>
-      <w:r>
-        <w:rPr>
-          <w:rtl w:val="0"/>
-        </w:rPr>
-        <w:t xml:space="preserve">Small-group discussion:</w:t>
-      </w:r>
-    </w:p>
-    <w:p>
-      <w:pPr>
-        <w:spacing w:after="240" w:before="240" w:lineRule="auto"/>
-        <w:rPr/>
-      </w:pPr>
-      <w:r>
-        <w:rPr>
-          <w:rtl w:val="0"/>
-        </w:rPr>
-        <w:t xml:space="preserve">Students share one skill they bring to research and one skill they want to develop.</w:t>
-      </w:r>
-    </w:p>
-    <w:p>
-      <w:pPr>
-        <w:spacing w:after="240" w:before="240" w:lineRule="auto"/>
-        <w:rPr/>
-      </w:pPr>
-      <w:r>
-        <w:rPr>
-          <w:rtl w:val="0"/>
-        </w:rPr>
-        <w:t xml:space="preserve">Optional extension:</w:t>
-      </w:r>
-    </w:p>
-    <w:p>
-      <w:pPr>
-        <w:spacing w:after="240" w:before="240" w:lineRule="auto"/>
-        <w:rPr/>
-      </w:pPr>
-      <w:r>
-        <w:rPr>
-          <w:rtl w:val="0"/>
-        </w:rPr>
-        <w:t xml:space="preserve">Students create a short “researcher profile” card to help the teacher identify possible mentor matches or project groupings.</w:t>
-      </w:r>
-    </w:p>
-    <w:p>
-      <w:pPr>
-        <w:pStyle w:val="Heading3"/>
-        <w:keepNext w:val="0"/>
-        <w:keepLines w:val="0"/>
-        <w:spacing w:before="280" w:lineRule="auto"/>
-        <w:rPr>
-          <w:b w:val="1"/>
-          <w:bCs w:val="1"/>
-          <w:color w:val="000000"/>
-          <w:sz w:val="26"/>
-          <w:szCs w:val="26"/>
-        </w:rPr>
-      </w:pPr>
-      <w:bookmarkStart w:colFirst="0" w:colLast="0" w:name="_tu7rsyf0u77q" w:id="20"/>
-      <w:bookmarkEnd w:id="20"/>
-      <w:r>
-        <w:rPr>
-          <w:b w:val="1"/>
-          <w:bCs w:val="1"/>
-          <w:color w:val="000000"/>
-          <w:sz w:val="26"/>
-          <w:szCs w:val="26"/>
-          <w:rtl w:val="0"/>
-        </w:rPr>
-        <w:t xml:space="preserve">Day 4: Research Ethics and Integrity</w:t>
-      </w:r>
-    </w:p>
-    <w:p>
-      <w:pPr>
-        <w:spacing w:after="240" w:before="240" w:lineRule="auto"/>
-        <w:rPr/>
-      </w:pPr>
-      <w:r>
-        <w:rPr>
-          <w:rtl w:val="0"/>
-        </w:rPr>
-        <w:t xml:space="preserve">Introduce the idea that student researchers have ethical responsibilities. This discussion should be age-appropriate but serious. Students should understand that curiosity does not override safety, honesty, consent, animal welfare, human subject protection, environmental responsibility, or proper credit to sources.</w:t>
-      </w:r>
-    </w:p>
-    <w:p>
-      <w:pPr>
-        <w:spacing w:after="240" w:before="240" w:lineRule="auto"/>
-        <w:rPr/>
-      </w:pPr>
-      <w:r>
-        <w:rPr>
-          <w:rtl w:val="0"/>
-        </w:rPr>
-        <w:t xml:space="preserve">Topics to introduce:</w:t>
-      </w:r>
-    </w:p>
-    <w:p>
-      <w:pPr>
-        <w:numPr>
-          <w:ilvl w:val="0"/>
-          <w:numId w:val="32"/>
-        </w:numPr>
-        <w:spacing w:after="0" w:afterAutospacing="0" w:before="240" w:lineRule="auto"/>
-        <w:ind w:left="720" w:hanging="360"/>
-      </w:pPr>
-      <w:r>
-        <w:rPr>
-          <w:rtl w:val="0"/>
-        </w:rPr>
-        <w:t xml:space="preserve">Honest data collection and reporting</w:t>
-      </w:r>
-    </w:p>
-    <w:p>
-      <w:pPr>
-        <w:numPr>
-          <w:ilvl w:val="0"/>
-          <w:numId w:val="32"/>
-        </w:numPr>
-        <w:spacing w:after="0" w:afterAutospacing="0" w:before="0" w:beforeAutospacing="0" w:lineRule="auto"/>
-        <w:ind w:left="720" w:hanging="360"/>
-      </w:pPr>
-      <w:r>
-        <w:rPr>
-          <w:rtl w:val="0"/>
-        </w:rPr>
-        <w:t xml:space="preserve">Not fabricating or deleting inconvenient data</w:t>
-      </w:r>
-    </w:p>
-    <w:p>
-      <w:pPr>
-        <w:numPr>
-          <w:ilvl w:val="0"/>
-          <w:numId w:val="32"/>
-        </w:numPr>
-        <w:spacing w:after="0" w:afterAutospacing="0" w:before="0" w:beforeAutospacing="0" w:lineRule="auto"/>
-        <w:ind w:left="720" w:hanging="360"/>
-      </w:pPr>
-      <w:r>
-        <w:rPr>
-          <w:rtl w:val="0"/>
-        </w:rPr>
-        <w:t xml:space="preserve">Proper credit for ideas, images, sources, and mentor contributions</w:t>
-      </w:r>
-    </w:p>
-    <w:p>
-      <w:pPr>
-        <w:numPr>
-          <w:ilvl w:val="0"/>
-          <w:numId w:val="32"/>
-        </w:numPr>
-        <w:spacing w:after="0" w:afterAutospacing="0" w:before="0" w:beforeAutospacing="0" w:lineRule="auto"/>
-        <w:ind w:left="720" w:hanging="360"/>
-      </w:pPr>
-      <w:r>
-        <w:rPr>
-          <w:rtl w:val="0"/>
-        </w:rPr>
-        <w:t xml:space="preserve">Safety procedures and teacher approval</w:t>
-      </w:r>
-    </w:p>
-    <w:p>
-      <w:pPr>
-        <w:numPr>
-          <w:ilvl w:val="0"/>
-          <w:numId w:val="32"/>
-        </w:numPr>
-        <w:spacing w:after="0" w:afterAutospacing="0" w:before="0" w:beforeAutospacing="0" w:lineRule="auto"/>
-        <w:ind w:left="720" w:hanging="360"/>
-      </w:pPr>
-      <w:r>
-        <w:rPr>
-          <w:rtl w:val="0"/>
-        </w:rPr>
-        <w:t xml:space="preserve">Human subjects research and informed consent</w:t>
-      </w:r>
-    </w:p>
-    <w:p>
-      <w:pPr>
-        <w:numPr>
-          <w:ilvl w:val="0"/>
-          <w:numId w:val="32"/>
-        </w:numPr>
-        <w:spacing w:after="0" w:afterAutospacing="0" w:before="0" w:beforeAutospacing="0" w:lineRule="auto"/>
-        <w:ind w:left="720" w:hanging="360"/>
-      </w:pPr>
-      <w:r>
-        <w:rPr>
-          <w:rtl w:val="0"/>
-        </w:rPr>
-        <w:t xml:space="preserve">Animal research restrictions</w:t>
-      </w:r>
-    </w:p>
-    <w:p>
-      <w:pPr>
-        <w:numPr>
-          <w:ilvl w:val="0"/>
-          <w:numId w:val="32"/>
-        </w:numPr>
-        <w:spacing w:after="0" w:afterAutospacing="0" w:before="0" w:beforeAutospacing="0" w:lineRule="auto"/>
-        <w:ind w:left="720" w:hanging="360"/>
-      </w:pPr>
-      <w:r>
-        <w:rPr>
-          <w:rtl w:val="0"/>
-        </w:rPr>
-        <w:t xml:space="preserve">Environmental responsibility</w:t>
-      </w:r>
-    </w:p>
-    <w:p>
-      <w:pPr>
-        <w:numPr>
-          <w:ilvl w:val="0"/>
-          <w:numId w:val="32"/>
-        </w:numPr>
-        <w:spacing w:after="0" w:afterAutospacing="0" w:before="0" w:beforeAutospacing="0" w:lineRule="auto"/>
-        <w:ind w:left="720" w:hanging="360"/>
-      </w:pPr>
-      <w:r>
-        <w:rPr>
-          <w:rtl w:val="0"/>
-        </w:rPr>
-        <w:t xml:space="preserve">Use of school, university, or community equipment</w:t>
-      </w:r>
-    </w:p>
-    <w:p>
-      <w:pPr>
-        <w:numPr>
-          <w:ilvl w:val="0"/>
-          <w:numId w:val="32"/>
-        </w:numPr>
-        <w:spacing w:after="240" w:before="0" w:beforeAutospacing="0" w:lineRule="auto"/>
-        <w:ind w:left="720" w:hanging="360"/>
-      </w:pPr>
-      <w:r>
-        <w:rPr>
-          <w:rtl w:val="0"/>
-        </w:rPr>
-        <w:t xml:space="preserve">Respectful collaboration with mentors and peers</w:t>
-      </w:r>
-    </w:p>
-    <w:p>
-      <w:pPr>
-        <w:spacing w:after="240" w:before="240" w:lineRule="auto"/>
-        <w:rPr/>
-      </w:pPr>
-      <w:r>
-        <w:rPr>
-          <w:rtl w:val="0"/>
-        </w:rPr>
-        <w:t xml:space="preserve">Students complete Student Handout 4: Research Ethics and Integrity Agreement.</w:t>
-      </w:r>
-    </w:p>
-    <w:p>
-      <w:pPr>
-        <w:spacing w:after="240" w:before="240" w:lineRule="auto"/>
-        <w:rPr/>
-      </w:pPr>
-      <w:r>
-        <w:rPr>
-          <w:rtl w:val="0"/>
-        </w:rPr>
-        <w:t xml:space="preserve">Teacher note:</w:t>
-      </w:r>
-    </w:p>
-    <w:p>
-      <w:pPr>
-        <w:spacing w:after="240" w:before="240" w:lineRule="auto"/>
-        <w:rPr/>
-      </w:pPr>
-      <w:r>
-        <w:rPr>
-          <w:rtl w:val="0"/>
-        </w:rPr>
-        <w:t xml:space="preserve">This is not the full safety approval process. That comes later. This is an introductory ethics foundation.</w:t>
-      </w:r>
-    </w:p>
-    <w:p>
-      <w:pPr>
-        <w:pStyle w:val="Heading3"/>
-        <w:keepNext w:val="0"/>
-        <w:keepLines w:val="0"/>
-        <w:spacing w:before="280" w:lineRule="auto"/>
-        <w:rPr>
-          <w:b w:val="1"/>
-          <w:bCs w:val="1"/>
-          <w:color w:val="000000"/>
-          <w:sz w:val="26"/>
-          <w:szCs w:val="26"/>
-        </w:rPr>
-      </w:pPr>
-      <w:bookmarkStart w:colFirst="0" w:colLast="0" w:name="_eso19tbunva6" w:id="21"/>
-      <w:bookmarkEnd w:id="21"/>
-      <w:r>
-        <w:rPr>
-          <w:b w:val="1"/>
-          <w:bCs w:val="1"/>
-          <w:color w:val="000000"/>
-          <w:sz w:val="26"/>
-          <w:szCs w:val="26"/>
-          <w:rtl w:val="0"/>
-        </w:rPr>
-        <w:t xml:space="preserve">Day 5: Research Interest Exploration</w:t>
-      </w:r>
-    </w:p>
-    <w:p>
-      <w:pPr>
-        <w:spacing w:after="240" w:before="240" w:lineRule="auto"/>
-        <w:rPr/>
-      </w:pPr>
-      <w:r>
-        <w:rPr>
-          <w:rtl w:val="0"/>
-        </w:rPr>
-        <w:t xml:space="preserve">Students complete Student Handout 3: Research Interest Inventory.</w:t>
-      </w:r>
-    </w:p>
-    <w:p>
-      <w:pPr>
-        <w:spacing w:after="240" w:before="240" w:lineRule="auto"/>
-        <w:rPr/>
-      </w:pPr>
-      <w:r>
-        <w:rPr>
-          <w:rtl w:val="0"/>
-        </w:rPr>
-        <w:t xml:space="preserve">Students should generate broad interest areas first, not final project questions. Encourage them to think across disciplines.</w:t>
-      </w:r>
-    </w:p>
-    <w:p>
-      <w:pPr>
-        <w:spacing w:after="240" w:before="240" w:lineRule="auto"/>
-        <w:rPr/>
-      </w:pPr>
-      <w:r>
-        <w:rPr>
-          <w:rtl w:val="0"/>
-        </w:rPr>
-        <w:t xml:space="preserve">Possible prompts:</w:t>
-      </w:r>
-    </w:p>
-    <w:p>
-      <w:pPr>
-        <w:numPr>
-          <w:ilvl w:val="0"/>
-          <w:numId w:val="72"/>
-        </w:numPr>
-        <w:spacing w:after="0" w:afterAutospacing="0" w:before="240" w:lineRule="auto"/>
-        <w:ind w:left="720" w:hanging="360"/>
-      </w:pPr>
-      <w:r>
-        <w:rPr>
-          <w:rtl w:val="0"/>
-        </w:rPr>
-        <w:t xml:space="preserve">What problems do you notice in your community?</w:t>
-      </w:r>
-    </w:p>
-    <w:p>
-      <w:pPr>
-        <w:numPr>
-          <w:ilvl w:val="0"/>
-          <w:numId w:val="72"/>
-        </w:numPr>
-        <w:spacing w:after="0" w:afterAutospacing="0" w:before="0" w:beforeAutospacing="0" w:lineRule="auto"/>
-        <w:ind w:left="720" w:hanging="360"/>
-      </w:pPr>
-      <w:r>
-        <w:rPr>
-          <w:rtl w:val="0"/>
-        </w:rPr>
-        <w:t xml:space="preserve">What scientific topics do you find yourself reading or watching videos about?</w:t>
-      </w:r>
-    </w:p>
-    <w:p>
-      <w:pPr>
-        <w:numPr>
-          <w:ilvl w:val="0"/>
-          <w:numId w:val="72"/>
-        </w:numPr>
-        <w:spacing w:after="0" w:afterAutospacing="0" w:before="0" w:beforeAutospacing="0" w:lineRule="auto"/>
-        <w:ind w:left="720" w:hanging="360"/>
-      </w:pPr>
-      <w:r>
-        <w:rPr>
-          <w:rtl w:val="0"/>
-        </w:rPr>
-        <w:t xml:space="preserve">What technologies do you wish existed?</w:t>
-      </w:r>
-    </w:p>
-    <w:p>
-      <w:pPr>
-        <w:numPr>
-          <w:ilvl w:val="0"/>
-          <w:numId w:val="72"/>
-        </w:numPr>
-        <w:spacing w:after="0" w:afterAutospacing="0" w:before="0" w:beforeAutospacing="0" w:lineRule="auto"/>
-        <w:ind w:left="720" w:hanging="360"/>
-      </w:pPr>
-      <w:r>
-        <w:rPr>
-          <w:rtl w:val="0"/>
-        </w:rPr>
-        <w:t xml:space="preserve">What natural phenomena confuse or fascinate you?</w:t>
-      </w:r>
-    </w:p>
-    <w:p>
-      <w:pPr>
-        <w:numPr>
-          <w:ilvl w:val="0"/>
-          <w:numId w:val="72"/>
-        </w:numPr>
-        <w:spacing w:after="0" w:afterAutospacing="0" w:before="0" w:beforeAutospacing="0" w:lineRule="auto"/>
-        <w:ind w:left="720" w:hanging="360"/>
-      </w:pPr>
-      <w:r>
-        <w:rPr>
-          <w:rtl w:val="0"/>
-        </w:rPr>
-        <w:t xml:space="preserve">What would you like to build, test, improve, or understand?</w:t>
-      </w:r>
-    </w:p>
-    <w:p>
-      <w:pPr>
-        <w:numPr>
-          <w:ilvl w:val="0"/>
-          <w:numId w:val="72"/>
-        </w:numPr>
-        <w:spacing w:after="240" w:before="0" w:beforeAutospacing="0" w:lineRule="auto"/>
-        <w:ind w:left="720" w:hanging="360"/>
-      </w:pPr>
-      <w:r>
-        <w:rPr>
-          <w:rtl w:val="0"/>
-        </w:rPr>
-        <w:t xml:space="preserve">What university labs, careers, or industries interest you?</w:t>
-      </w:r>
-    </w:p>
-    <w:p>
-      <w:pPr>
-        <w:spacing w:after="240" w:before="240" w:lineRule="auto"/>
-        <w:rPr/>
-      </w:pPr>
-      <w:r>
-        <w:rPr>
-          <w:rtl w:val="0"/>
-        </w:rPr>
-        <w:t xml:space="preserve">Students end the week by listing their top five possible research areas.</w:t>
-      </w:r>
-    </w:p>
-    <w:p>
-      <w:pPr>
-        <w:pStyle w:val="Heading2"/>
-        <w:keepNext w:val="0"/>
-        <w:keepLines w:val="0"/>
-        <w:spacing w:after="80" w:lineRule="auto"/>
-        <w:rPr>
-          <w:b w:val="1"/>
-          <w:bCs w:val="1"/>
-          <w:sz w:val="34"/>
-          <w:szCs w:val="34"/>
-        </w:rPr>
-      </w:pPr>
-      <w:bookmarkStart w:colFirst="0" w:colLast="0" w:name="_v3fn182zg2r" w:id="22"/>
-      <w:bookmarkEnd w:id="22"/>
-      <w:r>
-        <w:rPr>
-          <w:b w:val="1"/>
-          <w:bCs w:val="1"/>
-          <w:sz w:val="34"/>
-          <w:szCs w:val="34"/>
-          <w:rtl w:val="0"/>
-        </w:rPr>
-        <w:t xml:space="preserve">Week 1 Deliverables</w:t>
-      </w:r>
-    </w:p>
-    <w:p>
-      <w:pPr>
-        <w:numPr>
-          <w:ilvl w:val="0"/>
-          <w:numId w:val="1"/>
-        </w:numPr>
-        <w:spacing w:after="0" w:afterAutospacing="0" w:before="240" w:lineRule="auto"/>
-        <w:ind w:left="720" w:hanging="360"/>
-      </w:pPr>
-      <w:r>
-        <w:rPr>
-          <w:rtl w:val="0"/>
-        </w:rPr>
-        <w:t xml:space="preserve">STARLAB course launch reflection</w:t>
-      </w:r>
-    </w:p>
-    <w:p>
-      <w:pPr>
-        <w:numPr>
-          <w:ilvl w:val="0"/>
-          <w:numId w:val="1"/>
-        </w:numPr>
-        <w:spacing w:after="0" w:afterAutospacing="0" w:before="0" w:beforeAutospacing="0" w:lineRule="auto"/>
-        <w:ind w:left="720" w:hanging="360"/>
-      </w:pPr>
-      <w:r>
-        <w:rPr>
-          <w:rtl w:val="0"/>
-        </w:rPr>
-        <w:t xml:space="preserve">Science identity and skills inventory</w:t>
-      </w:r>
-    </w:p>
-    <w:p>
-      <w:pPr>
-        <w:numPr>
-          <w:ilvl w:val="0"/>
-          <w:numId w:val="1"/>
-        </w:numPr>
-        <w:spacing w:after="0" w:afterAutospacing="0" w:before="0" w:beforeAutospacing="0" w:lineRule="auto"/>
-        <w:ind w:left="720" w:hanging="360"/>
-      </w:pPr>
-      <w:r>
-        <w:rPr>
-          <w:rtl w:val="0"/>
-        </w:rPr>
-        <w:t xml:space="preserve">Research ethics and integrity agreement</w:t>
-      </w:r>
-    </w:p>
-    <w:p>
-      <w:pPr>
-        <w:numPr>
-          <w:ilvl w:val="0"/>
-          <w:numId w:val="1"/>
-        </w:numPr>
-        <w:spacing w:after="0" w:afterAutospacing="0" w:before="0" w:beforeAutospacing="0" w:lineRule="auto"/>
-        <w:ind w:left="720" w:hanging="360"/>
-      </w:pPr>
-      <w:r>
-        <w:rPr>
-          <w:rtl w:val="0"/>
-        </w:rPr>
-        <w:t xml:space="preserve">Research interest inventory</w:t>
-      </w:r>
-    </w:p>
-    <w:p>
-      <w:pPr>
-        <w:numPr>
-          <w:ilvl w:val="0"/>
-          <w:numId w:val="1"/>
-        </w:numPr>
-        <w:spacing w:after="240" w:before="0" w:beforeAutospacing="0" w:lineRule="auto"/>
-        <w:ind w:left="720" w:hanging="360"/>
-      </w:pPr>
-      <w:r>
-        <w:rPr>
-          <w:rtl w:val="0"/>
-        </w:rPr>
-        <w:t xml:space="preserve">Top five possible research areas</w:t>
-      </w:r>
-    </w:p>
-    <w:p>
-      <w:pPr>
-        <w:pStyle w:val="Heading2"/>
-        <w:keepNext w:val="0"/>
-        <w:keepLines w:val="0"/>
-        <w:spacing w:after="80" w:lineRule="auto"/>
-        <w:rPr>
-          <w:b w:val="1"/>
-          <w:bCs w:val="1"/>
-          <w:sz w:val="34"/>
-          <w:szCs w:val="34"/>
         </w:rPr>
       </w:pPr>
       <w:bookmarkStart w:colFirst="0" w:colLast="0" w:name="_w5etuj2pfmag" w:id="23"/>
       <w:bookmarkEnd w:id="23"/>
       <w:r>
         <w:rPr>
-          <w:b w:val="1"/>
+          <w:rFonts w:ascii="Arial" w:hAnsi="Arial" w:eastAsia="Arial" w:cs="Arial"/>
+          <w:b/>
           <w:bCs w:val="1"/>
+          <w:color w:val="E31B23"/>
           <w:sz w:val="34"/>
           <w:szCs w:val="34"/>
           <w:rtl w:val="0"/>
@@ -1738,38 +2302,72 @@
     </w:p>
     <w:p>
       <w:pPr>
-        <w:spacing w:after="240" w:before="240" w:lineRule="auto"/>
-        <w:rPr/>
+        <w:keepNext w:val="0"/>
+        <w:widowControl/>
+        <w:spacing w:after="80" w:before="0" w:lineRule="auto" w:line="252"/>
+        <w:rPr>
+          <w:rFonts w:ascii="Arial" w:hAnsi="Arial" w:eastAsia="Arial" w:cs="Arial"/>
+        </w:rPr>
       </w:pPr>
       <w:r>
         <w:rPr>
+          <w:rFonts w:ascii="Arial" w:hAnsi="Arial" w:eastAsia="Arial" w:cs="Arial"/>
+          <w:color w:val="111111"/>
           <w:rtl w:val="0"/>
         </w:rPr>
         <w:t xml:space="preserve">Do not rush students into final questions during Week 1. The goal is to expand before narrowing. Students who choose too quickly often pick projects that are either too simple, too broad, unsafe, impossible to measure, or copied directly from online project lists.</w:t>
       </w:r>
     </w:p>
-    <w:p>
-      <w:pPr>
-        <w:rPr/>
-      </w:pPr>
-      <w:r>
-        <w:pict>
-          <v:rect style="width:0.0pt;height:1.5pt" o:hr="t" o:hrstd="t" o:hralign="center" fillcolor="#A0A0A0" stroked="f"/>
-        </w:pict>
-      </w:r>
-      <w:r>
-        <w:rPr>
-          <w:rtl w:val="0"/>
-        </w:rPr>
-      </w:r>
-    </w:p>
     <w:sectPr>
-      <w:pgSz w:h="15840" w:w="12240" w:orient="portrait"/>
-      <w:pgMar w:bottom="1440" w:top="1440" w:left="1440" w:right="1440" w:header="720" w:footer="720"/>
+      <w:headerReference w:type="default" r:id="rId6"/>
+      <w:footerReference w:type="default" r:id="rId7"/>
+      <w:pgSz w:h="15840" w:w="12240"/>
+      <w:pgMar w:bottom="864" w:top="936" w:left="1080" w:right="1080" w:header="360" w:footer="432"/>
       <w:pgNumType w:start="1"/>
     </w:sectPr>
   </w:body>
 </w:document>
+</file>
+
+<file path=word/footer1.xml><?xml version="1.0" encoding="utf-8"?>
+<w:ftr xmlns:m="http://schemas.openxmlformats.org/officeDocument/2006/math" xmlns:mc="http://schemas.openxmlformats.org/markup-compatibility/2006" xmlns:mo="http://schemas.microsoft.com/office/mac/office/2008/main" xmlns:mv="urn:schemas-microsoft-com:mac:vml" xmlns:o="urn:schemas-microsoft-com:office:office" xmlns:r="http://schemas.openxmlformats.org/officeDocument/2006/relationships" xmlns:v="urn:schemas-microsoft-com:vml" xmlns:w10="urn:schemas-microsoft-com:office:word" xmlns:w14="http://schemas.microsoft.com/office/word/2010/wordml" xmlns:w="http://schemas.openxmlformats.org/wordprocessingml/2006/main" xmlns:wne="http://schemas.microsoft.com/office/word/2006/wordml" xmlns:wp14="http://schemas.microsoft.com/office/word/2010/wordprocessingDrawing" xmlns:wp="http://schemas.openxmlformats.org/drawingml/2006/wordprocessingDrawing" xmlns:wpc="http://schemas.microsoft.com/office/word/2010/wordprocessingCanvas" xmlns:wpg="http://schemas.microsoft.com/office/word/2010/wordprocessingGroup" xmlns:wpi="http://schemas.microsoft.com/office/word/2010/wordprocessingInk" xmlns:wps="http://schemas.microsoft.com/office/word/2010/wordprocessingShape" mc:Ignorable="w14 wp14">
+  <w:p>
+    <w:pPr>
+      <w:pStyle w:val="footer"/>
+      <w:jc w:val="center"/>
+    </w:pPr>
+    <w:r>
+      <w:rPr>
+        <w:rFonts w:ascii="Arial" w:hAnsi="Arial"/>
+        <w:color w:val="555555"/>
+        <w:sz w:val="17"/>
+      </w:rPr>
+      <w:t xml:space="preserve">STARLAB | UNIT 1 | WEEK 1 | PAGE </w:t>
+    </w:r>
+    <w:r>
+      <w:rPr>
+        <w:rFonts w:ascii="Arial" w:hAnsi="Arial"/>
+        <w:color w:val="555555"/>
+        <w:sz w:val="17"/>
+      </w:rPr>
+      <w:fldChar w:fldCharType="begin"/>
+      <w:instrText xml:space="preserve"> PAGE </w:instrText>
+      <w:fldChar w:fldCharType="separate"/>
+      <w:t>1</w:t>
+      <w:fldChar w:fldCharType="end"/>
+    </w:r>
+  </w:p>
+</w:ftr>
+</file>
+
+<file path=word/header1.xml><?xml version="1.0" encoding="utf-8"?>
+<w:hdr xmlns:m="http://schemas.openxmlformats.org/officeDocument/2006/math" xmlns:mc="http://schemas.openxmlformats.org/markup-compatibility/2006" xmlns:mo="http://schemas.microsoft.com/office/mac/office/2008/main" xmlns:mv="urn:schemas-microsoft-com:mac:vml" xmlns:o="urn:schemas-microsoft-com:office:office" xmlns:r="http://schemas.openxmlformats.org/officeDocument/2006/relationships" xmlns:v="urn:schemas-microsoft-com:vml" xmlns:w10="urn:schemas-microsoft-com:office:word" xmlns:w14="http://schemas.microsoft.com/office/word/2010/wordml" xmlns:w="http://schemas.openxmlformats.org/wordprocessingml/2006/main" xmlns:wne="http://schemas.microsoft.com/office/word/2006/wordml" xmlns:wp14="http://schemas.microsoft.com/office/word/2010/wordprocessingDrawing" xmlns:wp="http://schemas.openxmlformats.org/drawingml/2006/wordprocessingDrawing" xmlns:wpc="http://schemas.microsoft.com/office/word/2010/wordprocessingCanvas" xmlns:wpg="http://schemas.microsoft.com/office/word/2010/wordprocessingGroup" xmlns:wpi="http://schemas.microsoft.com/office/word/2010/wordprocessingInk" xmlns:wps="http://schemas.microsoft.com/office/word/2010/wordprocessingShape" mc:Ignorable="w14 wp14">
+  <w:p>
+    <w:pPr>
+      <w:pStyle w:val="Header"/>
+    </w:pPr>
+  </w:p>
+</w:hdr>
 </file>
 
 <file path=word/numbering.xml><?xml version="1.0" encoding="utf-8"?>
@@ -9910,6 +10508,28 @@
   <w:num w:numId="72">
     <w:abstractNumId w:val="72"/>
   </w:num>
+  <w:abstractNum w:abstractNumId="73">
+    <w:multiLevelType w:val="singleLevel"/>
+    <w:lvl w:ilvl="0">
+      <w:start w:val="1"/>
+      <w:numFmt w:val="bullet"/>
+      <w:lvlText w:val="•"/>
+      <w:lvlJc w:val="left"/>
+      <w:pPr>
+        <w:tabs>
+          <w:tab w:val="num" w:pos="360"/>
+        </w:tabs>
+        <w:ind w:left="540" w:hanging="180"/>
+      </w:pPr>
+      <w:rPr>
+        <w:rFonts w:ascii="Arial" w:hAnsi="Arial" w:eastAsia="Arial" w:cs="Arial"/>
+        <w:sz w:val="21"/>
+      </w:rPr>
+    </w:lvl>
+  </w:abstractNum>
+  <w:num w:numId="73">
+    <w:abstractNumId w:val="73"/>
+  </w:num>
 </w:numbering>
 </file>
 
@@ -9943,19 +10563,34 @@
   </w:style>
   <w:style w:type="paragraph" w:styleId="Normal" w:default="1">
     <w:name w:val="normal"/>
+    <w:pPr>
+      <w:widowControl/>
+      <w:spacing w:before="0" w:after="80" w:line="252" w:lineRule="auto"/>
+    </w:pPr>
+    <w:rPr>
+      <w:rFonts w:ascii="Arial" w:hAnsi="Arial" w:eastAsia="Arial" w:cs="Arial"/>
+      <w:b w:val="0"/>
+      <w:i w:val="0"/>
+      <w:color w:val="111111"/>
+      <w:sz w:val="20"/>
+    </w:rPr>
   </w:style>
   <w:style w:type="paragraph" w:styleId="Heading1">
     <w:name w:val="heading 1"/>
     <w:basedOn w:val="Normal"/>
     <w:next w:val="Normal"/>
     <w:pPr>
-      <w:keepNext w:val="1"/>
+      <w:keepNext/>
       <w:keepLines w:val="1"/>
       <w:pageBreakBefore w:val="0"/>
-      <w:spacing w:after="120" w:before="400" w:lineRule="auto"/>
+      <w:spacing w:after="120" w:before="280" w:lineRule="auto"/>
     </w:pPr>
     <w:rPr>
-      <w:sz w:val="40"/>
+      <w:rFonts w:ascii="Arial" w:hAnsi="Arial" w:eastAsia="Arial" w:cs="Arial"/>
+      <w:b/>
+      <w:i w:val="0"/>
+      <w:color w:val="E31B23"/>
+      <w:sz w:val="32"/>
       <w:szCs w:val="40"/>
     </w:rPr>
   </w:style>
@@ -9964,15 +10599,18 @@
     <w:basedOn w:val="Normal"/>
     <w:next w:val="Normal"/>
     <w:pPr>
-      <w:keepNext w:val="1"/>
+      <w:keepNext/>
       <w:keepLines w:val="1"/>
       <w:pageBreakBefore w:val="0"/>
-      <w:spacing w:after="120" w:before="360" w:lineRule="auto"/>
+      <w:spacing w:after="80" w:before="220" w:lineRule="auto"/>
     </w:pPr>
     <w:rPr>
-      <w:b w:val="0"/>
+      <w:rFonts w:ascii="Arial" w:hAnsi="Arial" w:eastAsia="Arial" w:cs="Arial"/>
+      <w:b/>
       <w:bCs w:val="0"/>
-      <w:sz w:val="32"/>
+      <w:i w:val="0"/>
+      <w:color w:val="E31B23"/>
+      <w:sz w:val="27"/>
       <w:szCs w:val="32"/>
     </w:rPr>
   </w:style>
@@ -9981,16 +10619,18 @@
     <w:basedOn w:val="Normal"/>
     <w:next w:val="Normal"/>
     <w:pPr>
-      <w:keepNext w:val="1"/>
+      <w:keepNext/>
       <w:keepLines w:val="1"/>
       <w:pageBreakBefore w:val="0"/>
-      <w:spacing w:after="80" w:before="320" w:lineRule="auto"/>
+      <w:spacing w:after="40" w:before="140" w:lineRule="auto"/>
     </w:pPr>
     <w:rPr>
-      <w:b w:val="0"/>
+      <w:rFonts w:ascii="Arial" w:hAnsi="Arial" w:eastAsia="Arial" w:cs="Arial"/>
+      <w:b/>
       <w:bCs w:val="0"/>
-      <w:color w:val="434343"/>
-      <w:sz w:val="28"/>
+      <w:i w:val="0"/>
+      <w:color w:val="111111"/>
+      <w:sz w:val="23"/>
       <w:szCs w:val="28"/>
     </w:rPr>
   </w:style>
@@ -10005,7 +10645,7 @@
       <w:spacing w:after="80" w:before="280" w:lineRule="auto"/>
     </w:pPr>
     <w:rPr>
-      <w:color w:val="666666"/>
+      <w:color w:val="555555"/>
       <w:sz w:val="24"/>
       <w:szCs w:val="24"/>
     </w:rPr>
@@ -10021,7 +10661,7 @@
       <w:spacing w:after="80" w:before="240" w:lineRule="auto"/>
     </w:pPr>
     <w:rPr>
-      <w:color w:val="666666"/>
+      <w:color w:val="555555"/>
       <w:sz w:val="22"/>
       <w:szCs w:val="22"/>
     </w:rPr>
@@ -10039,7 +10679,7 @@
     <w:rPr>
       <w:i w:val="1"/>
       <w:iCs w:val="1"/>
-      <w:color w:val="666666"/>
+      <w:color w:val="555555"/>
       <w:sz w:val="22"/>
       <w:szCs w:val="22"/>
     </w:rPr>
@@ -10052,10 +10692,14 @@
       <w:keepNext w:val="1"/>
       <w:keepLines w:val="1"/>
       <w:pageBreakBefore w:val="0"/>
-      <w:spacing w:after="60" w:before="0" w:lineRule="auto"/>
+      <w:spacing w:after="80" w:before="0" w:lineRule="auto"/>
     </w:pPr>
     <w:rPr>
-      <w:sz w:val="52"/>
+      <w:rFonts w:ascii="Arial" w:hAnsi="Arial" w:eastAsia="Arial" w:cs="Arial"/>
+      <w:b/>
+      <w:i w:val="0"/>
+      <w:color w:val="111111"/>
+      <w:sz w:val="48"/>
       <w:szCs w:val="52"/>
     </w:rPr>
   </w:style>
@@ -10067,14 +10711,15 @@
       <w:keepNext w:val="1"/>
       <w:keepLines w:val="1"/>
       <w:pageBreakBefore w:val="0"/>
-      <w:spacing w:after="320" w:before="0" w:lineRule="auto"/>
+      <w:spacing w:after="240" w:before="0" w:lineRule="auto"/>
     </w:pPr>
     <w:rPr>
       <w:rFonts w:ascii="Arial" w:cs="Arial" w:eastAsia="Arial" w:hAnsi="Arial"/>
+      <w:b/>
       <w:i w:val="0"/>
       <w:iCs w:val="0"/>
-      <w:color w:val="666666"/>
-      <w:sz w:val="30"/>
+      <w:color w:val="555555"/>
+      <w:sz w:val="21"/>
       <w:szCs w:val="30"/>
     </w:rPr>
   </w:style>
@@ -10134,6 +10779,132 @@
       <w:tblCellMar/>
     </w:tblPr>
   </w:style>
+  <w:style w:type="paragraph" w:customStyle="1" w:styleId="STARLABBrand">
+    <w:name w:val="STARLAB Brand"/>
+    <w:basedOn w:val="Normal"/>
+    <w:pPr>
+      <w:keepNext/>
+      <w:spacing w:before="0" w:after="40"/>
+    </w:pPr>
+    <w:rPr>
+      <w:rFonts w:ascii="Arial" w:hAnsi="Arial" w:eastAsia="Arial" w:cs="Arial"/>
+      <w:b/>
+      <w:i w:val="0"/>
+      <w:color w:val="E31B23"/>
+      <w:sz w:val="21"/>
+    </w:rPr>
+  </w:style>
+  <w:style w:type="paragraph" w:customStyle="1" w:styleId="STARLABWeekTitle">
+    <w:name w:val="STARLAB Week Title"/>
+    <w:basedOn w:val="Normal"/>
+    <w:pPr>
+      <w:keepNext/>
+      <w:spacing w:before="0" w:after="80" w:line="240" w:lineRule="auto"/>
+    </w:pPr>
+    <w:rPr>
+      <w:rFonts w:ascii="Arial" w:hAnsi="Arial" w:eastAsia="Arial" w:cs="Arial"/>
+      <w:b/>
+      <w:i w:val="0"/>
+      <w:color w:val="111111"/>
+      <w:sz w:val="48"/>
+    </w:rPr>
+  </w:style>
+  <w:style w:type="paragraph" w:customStyle="1" w:styleId="STARLABGuideSubtitle">
+    <w:name w:val="STARLAB Guide Subtitle"/>
+    <w:basedOn w:val="Normal"/>
+    <w:pPr>
+      <w:keepNext/>
+      <w:spacing w:before="0" w:after="260"/>
+    </w:pPr>
+    <w:rPr>
+      <w:rFonts w:ascii="Arial" w:hAnsi="Arial" w:eastAsia="Arial" w:cs="Arial"/>
+      <w:b/>
+      <w:i w:val="0"/>
+      <w:color w:val="555555"/>
+      <w:sz w:val="21"/>
+    </w:rPr>
+  </w:style>
+  <w:style w:type="paragraph" w:customStyle="1" w:styleId="STARLABLabel">
+    <w:name w:val="STARLAB Label"/>
+    <w:basedOn w:val="Normal"/>
+    <w:pPr>
+      <w:keepNext/>
+      <w:spacing w:before="80" w:after="20"/>
+    </w:pPr>
+    <w:rPr>
+      <w:rFonts w:ascii="Arial" w:hAnsi="Arial" w:eastAsia="Arial" w:cs="Arial"/>
+      <w:b/>
+      <w:i w:val="0"/>
+      <w:color w:val="111111"/>
+      <w:sz w:val="20"/>
+    </w:rPr>
+  </w:style>
+  <w:style w:type="paragraph" w:customStyle="1" w:styleId="STARLABDeckUse">
+    <w:name w:val="STARLAB Deck Use"/>
+    <w:basedOn w:val="Normal"/>
+    <w:pPr>
+      <w:keepLines/>
+      <w:spacing w:before="40" w:after="140"/>
+      <w:ind w:left="187" w:right="115"/>
+    </w:pPr>
+    <w:rPr>
+      <w:rFonts w:ascii="Arial" w:hAnsi="Arial" w:eastAsia="Arial" w:cs="Arial"/>
+      <w:b w:val="0"/>
+      <w:i w:val="0"/>
+      <w:color w:val="111111"/>
+      <w:sz w:val="20"/>
+    </w:rPr>
+  </w:style>
+  <w:style w:type="paragraph" w:customStyle="1" w:styleId="ListBullet">
+    <w:name w:val="List Bullet"/>
+    <w:pPr>
+      <w:spacing w:before="0" w:after="40" w:line="252" w:lineRule="auto"/>
+    </w:pPr>
+    <w:rPr>
+      <w:rFonts w:ascii="Arial" w:hAnsi="Arial" w:eastAsia="Arial" w:cs="Arial"/>
+      <w:b w:val="0"/>
+      <w:i w:val="0"/>
+      <w:color w:val="111111"/>
+      <w:sz w:val="20"/>
+    </w:rPr>
+  </w:style>
+  <w:style w:type="paragraph" w:customStyle="1" w:styleId="ListNumber">
+    <w:name w:val="List Number"/>
+    <w:pPr>
+      <w:spacing w:before="0" w:after="40" w:line="252" w:lineRule="auto"/>
+    </w:pPr>
+    <w:rPr>
+      <w:rFonts w:ascii="Arial" w:hAnsi="Arial" w:eastAsia="Arial" w:cs="Arial"/>
+      <w:b w:val="0"/>
+      <w:i w:val="0"/>
+      <w:color w:val="111111"/>
+      <w:sz w:val="20"/>
+    </w:rPr>
+  </w:style>
+  <w:style w:type="paragraph" w:customStyle="1" w:styleId="footer">
+    <w:name w:val="footer"/>
+    <w:pPr>
+      <w:spacing w:before="0" w:after="0"/>
+    </w:pPr>
+    <w:rPr>
+      <w:rFonts w:ascii="Arial" w:hAnsi="Arial" w:eastAsia="Arial" w:cs="Arial"/>
+      <w:b w:val="0"/>
+      <w:i w:val="0"/>
+      <w:color w:val="555555"/>
+      <w:sz w:val="17"/>
+    </w:rPr>
+  </w:style>
+  <w:style w:type="character" w:customStyle="1" w:styleId="Hyperlink">
+    <w:name w:val="Hyperlink"/>
+    <w:rPr>
+      <w:rFonts w:ascii="Arial" w:hAnsi="Arial" w:eastAsia="Arial" w:cs="Arial"/>
+      <w:b w:val="0"/>
+      <w:i w:val="0"/>
+      <w:color w:val="E31B23"/>
+      <w:sz w:val="20"/>
+      <w:u w:val="single"/>
+    </w:rPr>
+  </w:style>
 </w:styles>
 </file>
 
@@ -10148,34 +10919,34 @@
         <a:sysClr val="window" lastClr="FFFFFF"/>
       </a:lt1>
       <a:dk2>
-        <a:srgbClr val="1F497D"/>
+        <a:srgbClr val="555555"/>
       </a:dk2>
       <a:lt2>
-        <a:srgbClr val="EEECE1"/>
+        <a:srgbClr val="E6E6E6"/>
       </a:lt2>
       <a:accent1>
-        <a:srgbClr val="4F81BD"/>
+        <a:srgbClr val="999999"/>
       </a:accent1>
       <a:accent2>
-        <a:srgbClr val="C0504D"/>
+        <a:srgbClr val="E31B23"/>
       </a:accent2>
       <a:accent3>
-        <a:srgbClr val="9BBB59"/>
+        <a:srgbClr val="999999"/>
       </a:accent3>
       <a:accent4>
-        <a:srgbClr val="8064A2"/>
+        <a:srgbClr val="999999"/>
       </a:accent4>
       <a:accent5>
-        <a:srgbClr val="4BACC6"/>
+        <a:srgbClr val="999999"/>
       </a:accent5>
       <a:accent6>
-        <a:srgbClr val="F79646"/>
+        <a:srgbClr val="999999"/>
       </a:accent6>
       <a:hlink>
-        <a:srgbClr val="0000FF"/>
+        <a:srgbClr val="555555"/>
       </a:hlink>
       <a:folHlink>
-        <a:srgbClr val="800080"/>
+        <a:srgbClr val="555555"/>
       </a:folHlink>
     </a:clrScheme>
     <a:fontScheme name="Office">

</xml_diff>